<commit_message>
Simplify account and envelope calculations
</commit_message>
<xml_diff>
--- a/docs/calculation-logic-ru.docx
+++ b/docs/calculation-logic-ru.docx
@@ -79,7 +79,7 @@
           <w:color w:val="1F2D3D"/>
           <w:sz w:val="22"/>
         </w:rPr>
-        <w:t>Этот документ описывает логику текущей версии приложения простыми словами.</w:t>
+        <w:t>Простое объяснение без сложных бухгалтерских слов.</w:t>
       </w:r>
     </w:p>
     <w:p>
@@ -87,7 +87,7 @@
         <w:pStyle w:val="Heading1"/>
       </w:pPr>
       <w:r>
-        <w:t>Самая короткая версия</w:t>
+        <w:t>1. Главное правило</w:t>
       </w:r>
     </w:p>
     <w:p>
@@ -102,25 +102,13 @@
           <w:color w:val="1F2D3D"/>
           <w:sz w:val="22"/>
         </w:rPr>
-        <w:t>В приложении есть два главных числа:</w:t>
+        <w:t>В приложении есть один общий счёт в BYN.</w:t>
       </w:r>
     </w:p>
     <w:p>
       <w:pPr>
-        <w:pStyle w:val="ListNumber"/>
-        <w:spacing w:after="60" w:line="269" w:lineRule="auto"/>
-        <w:ind w:left="461" w:hanging="259"/>
+        <w:spacing w:after="100" w:line="276" w:lineRule="auto"/>
       </w:pPr>
-      <w:r>
-        <w:rPr>
-          <w:rFonts w:ascii="Aptos" w:hAnsi="Aptos" w:eastAsia="Aptos"/>
-          <w:b/>
-          <w:i w:val="0"/>
-          <w:color w:val="1F2D3D"/>
-          <w:sz w:val="22"/>
-        </w:rPr>
-        <w:t>Осталось на счете</w:t>
-      </w:r>
       <w:r>
         <w:rPr>
           <w:rFonts w:ascii="Aptos" w:hAnsi="Aptos" w:eastAsia="Aptos"/>
@@ -129,25 +117,38 @@
           <w:color w:val="1F2D3D"/>
           <w:sz w:val="22"/>
         </w:rPr>
-        <w:t xml:space="preserve"> - сколько денег сейчас действительно лежит на обычном счете.</w:t>
+        <w:t>Он похож на банковскую карту: деньги на нём не относятся к отдельному месяцу. Когда начинается новый месяц, приложение ничего не переносит и не создаёт второй остаток. Оно просто продолжает показывать тот же настоящий счёт.</w:t>
       </w:r>
     </w:p>
     <w:p>
       <w:pPr>
-        <w:pStyle w:val="ListNumber"/>
-        <w:spacing w:after="60" w:line="269" w:lineRule="auto"/>
-        <w:ind w:left="461" w:hanging="259"/>
+        <w:spacing w:after="140" w:line="276" w:lineRule="auto" w:before="60"/>
+        <w:ind w:left="230" w:right="230"/>
+        <w:shd w:fill="EEF5F1"/>
       </w:pPr>
       <w:r>
         <w:rPr>
           <w:rFonts w:ascii="Aptos" w:hAnsi="Aptos" w:eastAsia="Aptos"/>
           <w:b/>
           <w:i w:val="0"/>
-          <w:color w:val="1F2D3D"/>
-          <w:sz w:val="22"/>
+          <w:color w:val="405B5E"/>
+          <w:sz w:val="23"/>
         </w:rPr>
-        <w:t>Свободный остаток</w:t>
+        <w:t>Автоматического переноса остатка с прошлого месяца больше нет.</w:t>
       </w:r>
+    </w:p>
+    <w:p>
+      <w:pPr>
+        <w:pStyle w:val="Heading1"/>
+      </w:pPr>
+      <w:r>
+        <w:t>2. Осталось на счёте</w:t>
+      </w:r>
+    </w:p>
+    <w:p>
+      <w:pPr>
+        <w:spacing w:after="100" w:line="276" w:lineRule="auto"/>
+      </w:pPr>
       <w:r>
         <w:rPr>
           <w:rFonts w:ascii="Aptos" w:hAnsi="Aptos" w:eastAsia="Aptos"/>
@@ -156,7 +157,179 @@
           <w:color w:val="1F2D3D"/>
           <w:sz w:val="22"/>
         </w:rPr>
-        <w:t xml:space="preserve"> - сколько из этих денег еще не обещано ни одной будущей трате.</w:t>
+        <w:t>«Осталось на счёте» — это деньги, которые действительно лежат на обычном счёте сейчас.</w:t>
+      </w:r>
+    </w:p>
+    <w:p>
+      <w:pPr>
+        <w:spacing w:after="100" w:line="276" w:lineRule="auto"/>
+      </w:pPr>
+      <w:r>
+        <w:rPr>
+          <w:rFonts w:ascii="Aptos" w:hAnsi="Aptos" w:eastAsia="Aptos"/>
+          <w:b w:val="0"/>
+          <w:i w:val="0"/>
+          <w:color w:val="1F2D3D"/>
+          <w:sz w:val="22"/>
+        </w:rPr>
+        <w:t>Сумма меняется только после понятной операции:</w:t>
+      </w:r>
+    </w:p>
+    <w:p>
+      <w:pPr>
+        <w:pStyle w:val="ListBullet"/>
+        <w:spacing w:after="60" w:line="269" w:lineRule="auto"/>
+        <w:ind w:left="403" w:hanging="230"/>
+      </w:pPr>
+      <w:r>
+        <w:rPr>
+          <w:rFonts w:ascii="Aptos" w:hAnsi="Aptos" w:eastAsia="Aptos"/>
+          <w:b w:val="0"/>
+          <w:i w:val="0"/>
+          <w:color w:val="1F2D3D"/>
+          <w:sz w:val="22"/>
+        </w:rPr>
+        <w:t>пришла зарплата или другой доход — сумма увеличилась;</w:t>
+      </w:r>
+    </w:p>
+    <w:p>
+      <w:pPr>
+        <w:pStyle w:val="ListBullet"/>
+        <w:spacing w:after="60" w:line="269" w:lineRule="auto"/>
+        <w:ind w:left="403" w:hanging="230"/>
+      </w:pPr>
+      <w:r>
+        <w:rPr>
+          <w:rFonts w:ascii="Aptos" w:hAnsi="Aptos" w:eastAsia="Aptos"/>
+          <w:b w:val="0"/>
+          <w:i w:val="0"/>
+          <w:color w:val="1F2D3D"/>
+          <w:sz w:val="22"/>
+        </w:rPr>
+        <w:t>записали расход — сумма уменьшилась;</w:t>
+      </w:r>
+    </w:p>
+    <w:p>
+      <w:pPr>
+        <w:pStyle w:val="ListBullet"/>
+        <w:spacing w:after="60" w:line="269" w:lineRule="auto"/>
+        <w:ind w:left="403" w:hanging="230"/>
+      </w:pPr>
+      <w:r>
+        <w:rPr>
+          <w:rFonts w:ascii="Aptos" w:hAnsi="Aptos" w:eastAsia="Aptos"/>
+          <w:b w:val="0"/>
+          <w:i w:val="0"/>
+          <w:color w:val="1F2D3D"/>
+          <w:sz w:val="22"/>
+        </w:rPr>
+        <w:t>перевели деньги в отдельный конверт — сумма уменьшилась;</w:t>
+      </w:r>
+    </w:p>
+    <w:p>
+      <w:pPr>
+        <w:pStyle w:val="ListBullet"/>
+        <w:spacing w:after="60" w:line="269" w:lineRule="auto"/>
+        <w:ind w:left="403" w:hanging="230"/>
+      </w:pPr>
+      <w:r>
+        <w:rPr>
+          <w:rFonts w:ascii="Aptos" w:hAnsi="Aptos" w:eastAsia="Aptos"/>
+          <w:b w:val="0"/>
+          <w:i w:val="0"/>
+          <w:color w:val="1F2D3D"/>
+          <w:sz w:val="22"/>
+        </w:rPr>
+        <w:t>вернули деньги из конверта — сумма увеличилась;</w:t>
+      </w:r>
+    </w:p>
+    <w:p>
+      <w:pPr>
+        <w:pStyle w:val="ListBullet"/>
+        <w:spacing w:after="60" w:line="269" w:lineRule="auto"/>
+        <w:ind w:left="403" w:hanging="230"/>
+      </w:pPr>
+      <w:r>
+        <w:rPr>
+          <w:rFonts w:ascii="Aptos" w:hAnsi="Aptos" w:eastAsia="Aptos"/>
+          <w:b w:val="0"/>
+          <w:i w:val="0"/>
+          <w:color w:val="1F2D3D"/>
+          <w:sz w:val="22"/>
+        </w:rPr>
+        <w:t>сделали ручную сверку — приложение добавило корректировку на разницу.</w:t>
+      </w:r>
+    </w:p>
+    <w:p>
+      <w:pPr>
+        <w:pStyle w:val="Heading1"/>
+      </w:pPr>
+      <w:r>
+        <w:t>3. Свободный остаток</w:t>
+      </w:r>
+    </w:p>
+    <w:p>
+      <w:pPr>
+        <w:spacing w:after="100" w:line="276" w:lineRule="auto"/>
+      </w:pPr>
+      <w:r>
+        <w:rPr>
+          <w:rFonts w:ascii="Aptos" w:hAnsi="Aptos" w:eastAsia="Aptos"/>
+          <w:b w:val="0"/>
+          <w:i w:val="0"/>
+          <w:color w:val="1F2D3D"/>
+          <w:sz w:val="22"/>
+        </w:rPr>
+        <w:t>Свободный остаток отвечает на вопрос:</w:t>
+      </w:r>
+    </w:p>
+    <w:p>
+      <w:pPr>
+        <w:spacing w:after="140" w:line="276" w:lineRule="auto" w:before="60"/>
+        <w:ind w:left="230" w:right="230"/>
+        <w:shd w:fill="EEF5F1"/>
+      </w:pPr>
+      <w:r>
+        <w:rPr>
+          <w:rFonts w:ascii="Aptos" w:hAnsi="Aptos" w:eastAsia="Aptos"/>
+          <w:b/>
+          <w:i w:val="0"/>
+          <w:color w:val="405B5E"/>
+          <w:sz w:val="23"/>
+        </w:rPr>
+        <w:t>«Сколько можно потратить на что угодно, не забрав деньги у оставшихся планов?»</w:t>
+      </w:r>
+    </w:p>
+    <w:p>
+      <w:pPr>
+        <w:spacing w:after="100" w:line="276" w:lineRule="auto"/>
+      </w:pPr>
+      <w:r>
+        <w:rPr>
+          <w:rFonts w:ascii="Aptos" w:hAnsi="Aptos" w:eastAsia="Aptos"/>
+          <w:b w:val="0"/>
+          <w:i w:val="0"/>
+          <w:color w:val="1F2D3D"/>
+          <w:sz w:val="22"/>
+        </w:rPr>
+        <w:t>Формула простая:</w:t>
+      </w:r>
+    </w:p>
+    <w:p>
+      <w:pPr>
+        <w:spacing w:after="140" w:line="276" w:lineRule="auto" w:before="60"/>
+        <w:ind w:left="230" w:right="230"/>
+        <w:shd w:fill="EEF5F1"/>
+      </w:pPr>
+      <w:r>
+        <w:rPr>
+          <w:rFonts w:ascii="Aptos" w:hAnsi="Aptos" w:eastAsia="Aptos"/>
+          <w:b/>
+          <w:i w:val="0"/>
+          <w:color w:val="405B5E"/>
+          <w:sz w:val="23"/>
+        </w:rPr>
+        <w:t>Свободный остаток = деньги на счёте - ещё не выполненные планы</w:t>
       </w:r>
     </w:p>
     <w:p>
@@ -188,7 +361,7 @@
           <w:color w:val="1F2D3D"/>
           <w:sz w:val="22"/>
         </w:rPr>
-        <w:t>на счете лежит 1 000 BYN;</w:t>
+        <w:t>на счёте 1 000 BYN;</w:t>
       </w:r>
     </w:p>
     <w:p>
@@ -205,7 +378,7 @@
           <w:color w:val="1F2D3D"/>
           <w:sz w:val="22"/>
         </w:rPr>
-        <w:t>400 BYN оставлено на квартиру;</w:t>
+        <w:t>на еду ещё запланировано 300 BYN;</w:t>
       </w:r>
     </w:p>
     <w:p>
@@ -222,7 +395,7 @@
           <w:color w:val="1F2D3D"/>
           <w:sz w:val="22"/>
         </w:rPr>
-        <w:t>300 BYN оставлено на еду;</w:t>
+        <w:t>на квартиру ещё запланировано 400 BYN;</w:t>
       </w:r>
     </w:p>
     <w:p>
@@ -239,7 +412,15 @@
           <w:color w:val="1F2D3D"/>
           <w:sz w:val="22"/>
         </w:rPr>
-        <w:t>значит, свободно только 300 BYN.</w:t>
+        <w:t>свободный остаток равен 300 BYN.</w:t>
+      </w:r>
+    </w:p>
+    <w:p>
+      <w:pPr>
+        <w:pStyle w:val="Heading1"/>
+      </w:pPr>
+      <w:r>
+        <w:t>4. Почему запланированный расход не вычитается два раза</w:t>
       </w:r>
     </w:p>
     <w:p>
@@ -254,15 +435,7 @@
           <w:color w:val="1F2D3D"/>
           <w:sz w:val="22"/>
         </w:rPr>
-        <w:t>Деньги на счете и свободные деньги - не одно и то же.</w:t>
-      </w:r>
-    </w:p>
-    <w:p>
-      <w:pPr>
-        <w:pStyle w:val="Heading1"/>
-      </w:pPr>
-      <w:r>
-        <w:t>1. Как устроен месяц</w:t>
+        <w:t>План заранее уменьшает только свободный остаток. Сам счёт он не меняет.</w:t>
       </w:r>
     </w:p>
     <w:p>
@@ -277,22 +450,7 @@
           <w:color w:val="1F2D3D"/>
           <w:sz w:val="22"/>
         </w:rPr>
-        <w:t>Финансовый месяц начинается в день зарплаты, указанный в настройках.</w:t>
-      </w:r>
-    </w:p>
-    <w:p>
-      <w:pPr>
-        <w:spacing w:after="100" w:line="276" w:lineRule="auto"/>
-      </w:pPr>
-      <w:r>
-        <w:rPr>
-          <w:rFonts w:ascii="Aptos" w:hAnsi="Aptos" w:eastAsia="Aptos"/>
-          <w:b w:val="0"/>
-          <w:i w:val="0"/>
-          <w:color w:val="1F2D3D"/>
-          <w:sz w:val="22"/>
-        </w:rPr>
-        <w:t>Например, если зарплата приходит 5 числа:</w:t>
+        <w:t>Когда расход совершается:</w:t>
       </w:r>
     </w:p>
     <w:p>
@@ -309,7 +467,7 @@
           <w:color w:val="1F2D3D"/>
           <w:sz w:val="22"/>
         </w:rPr>
-        <w:t>июльский период идет с 5 июля по 4 августа;</w:t>
+        <w:t>деньги уходят со счёта;</w:t>
       </w:r>
     </w:p>
     <w:p>
@@ -326,75 +484,7 @@
           <w:color w:val="1F2D3D"/>
           <w:sz w:val="22"/>
         </w:rPr>
-        <w:t>августовский период идет с 5 августа по 4 сентября.</w:t>
-      </w:r>
-    </w:p>
-    <w:p>
-      <w:pPr>
-        <w:spacing w:after="100" w:line="276" w:lineRule="auto"/>
-      </w:pPr>
-      <w:r>
-        <w:rPr>
-          <w:rFonts w:ascii="Aptos" w:hAnsi="Aptos" w:eastAsia="Aptos"/>
-          <w:b w:val="0"/>
-          <w:i w:val="0"/>
-          <w:color w:val="1F2D3D"/>
-          <w:sz w:val="22"/>
-        </w:rPr>
-        <w:t>Это не всегда совпадает с обычным календарным месяцем.</w:t>
-      </w:r>
-    </w:p>
-    <w:p>
-      <w:pPr>
-        <w:pStyle w:val="Heading1"/>
-      </w:pPr>
-      <w:r>
-        <w:t>2. Как устроены недели</w:t>
-      </w:r>
-    </w:p>
-    <w:p>
-      <w:pPr>
-        <w:spacing w:after="100" w:line="276" w:lineRule="auto"/>
-      </w:pPr>
-      <w:r>
-        <w:rPr>
-          <w:rFonts w:ascii="Aptos" w:hAnsi="Aptos" w:eastAsia="Aptos"/>
-          <w:b w:val="0"/>
-          <w:i w:val="0"/>
-          <w:color w:val="1F2D3D"/>
-          <w:sz w:val="22"/>
-        </w:rPr>
-        <w:t>Обычная неделя начинается в понедельник в 00:00 и заканчивается в следующий понедельник в 00:00.</w:t>
-      </w:r>
-    </w:p>
-    <w:p>
-      <w:pPr>
-        <w:spacing w:after="100" w:line="276" w:lineRule="auto"/>
-      </w:pPr>
-      <w:r>
-        <w:rPr>
-          <w:rFonts w:ascii="Aptos" w:hAnsi="Aptos" w:eastAsia="Aptos"/>
-          <w:b w:val="0"/>
-          <w:i w:val="0"/>
-          <w:color w:val="1F2D3D"/>
-          <w:sz w:val="22"/>
-        </w:rPr>
-        <w:t>Если граница финансового месяца попала внутрь недели, приложение делит ее на две части. Обе части получают пометку «неполная неделя».</w:t>
-      </w:r>
-    </w:p>
-    <w:p>
-      <w:pPr>
-        <w:spacing w:after="100" w:line="276" w:lineRule="auto"/>
-      </w:pPr>
-      <w:r>
-        <w:rPr>
-          <w:rFonts w:ascii="Aptos" w:hAnsi="Aptos" w:eastAsia="Aptos"/>
-          <w:b w:val="0"/>
-          <w:i w:val="0"/>
-          <w:color w:val="1F2D3D"/>
-          <w:sz w:val="22"/>
-        </w:rPr>
-        <w:t>Пример: новый финансовый месяц начинается 5 августа, а календарная неделя идет с 3 по 9 августа.</w:t>
+        <w:t>выполненная часть плана становится меньше;</w:t>
       </w:r>
     </w:p>
     <w:p>
@@ -411,79 +501,7 @@
           <w:color w:val="1F2D3D"/>
           <w:sz w:val="22"/>
         </w:rPr>
-        <w:t>старый месяц получает 3-4 августа;</w:t>
-      </w:r>
-    </w:p>
-    <w:p>
-      <w:pPr>
-        <w:pStyle w:val="ListBullet"/>
-        <w:spacing w:after="60" w:line="269" w:lineRule="auto"/>
-        <w:ind w:left="403" w:hanging="230"/>
-      </w:pPr>
-      <w:r>
-        <w:rPr>
-          <w:rFonts w:ascii="Aptos" w:hAnsi="Aptos" w:eastAsia="Aptos"/>
-          <w:b w:val="0"/>
-          <w:i w:val="0"/>
-          <w:color w:val="1F2D3D"/>
-          <w:sz w:val="22"/>
-        </w:rPr>
-        <w:t>новый месяц получает 5-9 августа.</w:t>
-      </w:r>
-    </w:p>
-    <w:p>
-      <w:pPr>
-        <w:spacing w:after="100" w:line="276" w:lineRule="auto"/>
-      </w:pPr>
-      <w:r>
-        <w:rPr>
-          <w:rFonts w:ascii="Aptos" w:hAnsi="Aptos" w:eastAsia="Aptos"/>
-          <w:b w:val="0"/>
-          <w:i w:val="0"/>
-          <w:color w:val="1F2D3D"/>
-          <w:sz w:val="22"/>
-        </w:rPr>
-        <w:t>Сумма на еду за месяц делится между неделями по количеству дней. Поэтому короткая неделя получает меньше денег, чем полная.</w:t>
-      </w:r>
-    </w:p>
-    <w:p>
-      <w:pPr>
-        <w:pStyle w:val="Heading1"/>
-      </w:pPr>
-      <w:r>
-        <w:t>3. Доход за период</w:t>
-      </w:r>
-    </w:p>
-    <w:p>
-      <w:pPr>
-        <w:spacing w:after="100" w:line="276" w:lineRule="auto"/>
-      </w:pPr>
-      <w:r>
-        <w:rPr>
-          <w:rFonts w:ascii="Aptos" w:hAnsi="Aptos" w:eastAsia="Aptos"/>
-          <w:b w:val="0"/>
-          <w:i w:val="0"/>
-          <w:color w:val="1F2D3D"/>
-          <w:sz w:val="22"/>
-        </w:rPr>
-        <w:t>Доход считается так:</w:t>
-      </w:r>
-    </w:p>
-    <w:p>
-      <w:pPr>
-        <w:spacing w:after="140" w:line="276" w:lineRule="auto" w:before="60"/>
-        <w:ind w:left="230" w:right="230"/>
-        <w:shd w:fill="EEF5F1"/>
-      </w:pPr>
-      <w:r>
-        <w:rPr>
-          <w:rFonts w:ascii="Aptos" w:hAnsi="Aptos" w:eastAsia="Aptos"/>
-          <w:b/>
-          <w:i w:val="0"/>
-          <w:color w:val="405B5E"/>
-          <w:sz w:val="23"/>
-        </w:rPr>
-        <w:t>Зарплата + дополнительный доход</w:t>
+        <w:t>свободный остаток не уменьшается второй раз.</w:t>
       </w:r>
     </w:p>
     <w:p>
@@ -515,7 +533,7 @@
           <w:color w:val="1F2D3D"/>
           <w:sz w:val="22"/>
         </w:rPr>
-        <w:t>зарплата: 1 500 BYN;</w:t>
+        <w:t>на счёте 1 000 BYN;</w:t>
       </w:r>
     </w:p>
     <w:p>
@@ -532,7 +550,7 @@
           <w:color w:val="1F2D3D"/>
           <w:sz w:val="22"/>
         </w:rPr>
-        <w:t>дополнительный доход: 100 BYN;</w:t>
+        <w:t>план еды 300 BYN;</w:t>
       </w:r>
     </w:p>
     <w:p>
@@ -549,45 +567,7 @@
           <w:color w:val="1F2D3D"/>
           <w:sz w:val="22"/>
         </w:rPr>
-        <w:t>всего дохода: 1 600 BYN.</w:t>
-      </w:r>
-    </w:p>
-    <w:p>
-      <w:pPr>
-        <w:pStyle w:val="Heading1"/>
-      </w:pPr>
-      <w:r>
-        <w:t>4. Что считается фактической тратой</w:t>
-      </w:r>
-    </w:p>
-    <w:p>
-      <w:pPr>
-        <w:spacing w:after="100" w:line="276" w:lineRule="auto"/>
-      </w:pPr>
-      <w:r>
-        <w:rPr>
-          <w:rFonts w:ascii="Aptos" w:hAnsi="Aptos" w:eastAsia="Aptos"/>
-          <w:b w:val="0"/>
-          <w:i w:val="0"/>
-          <w:color w:val="1F2D3D"/>
-          <w:sz w:val="22"/>
-        </w:rPr>
-        <w:t>Фактическая трата - это деньги, которые уже ушли, а не просто были запланированы.</w:t>
-      </w:r>
-    </w:p>
-    <w:p>
-      <w:pPr>
-        <w:spacing w:after="100" w:line="276" w:lineRule="auto"/>
-      </w:pPr>
-      <w:r>
-        <w:rPr>
-          <w:rFonts w:ascii="Aptos" w:hAnsi="Aptos" w:eastAsia="Aptos"/>
-          <w:b w:val="0"/>
-          <w:i w:val="0"/>
-          <w:color w:val="1F2D3D"/>
-          <w:sz w:val="22"/>
-        </w:rPr>
-        <w:t>В общую сумму фактических трат входят:</w:t>
+        <w:t>свободно 700 BYN;</w:t>
       </w:r>
     </w:p>
     <w:p>
@@ -604,7 +584,7 @@
           <w:color w:val="1F2D3D"/>
           <w:sz w:val="22"/>
         </w:rPr>
-        <w:t>уже оплаченная квартира;</w:t>
+        <w:t>потратили 100 BYN на еду;</w:t>
       </w:r>
     </w:p>
     <w:p>
@@ -621,7 +601,7 @@
           <w:color w:val="1F2D3D"/>
           <w:sz w:val="22"/>
         </w:rPr>
-        <w:t>деньги, уже положенные в резерв;</w:t>
+        <w:t>на счёте осталось 900 BYN;</w:t>
       </w:r>
     </w:p>
     <w:p>
@@ -638,7 +618,7 @@
           <w:color w:val="1F2D3D"/>
           <w:sz w:val="22"/>
         </w:rPr>
-        <w:t>уже совершенные платежи;</w:t>
+        <w:t>в плане еды осталось 200 BYN;</w:t>
       </w:r>
     </w:p>
     <w:p>
@@ -655,7 +635,168 @@
           <w:color w:val="1F2D3D"/>
           <w:sz w:val="22"/>
         </w:rPr>
-        <w:t>деньги, уже отложенные в накопления в BYN;</w:t>
+        <w:t>свободно по-прежнему 700 BYN.</w:t>
+      </w:r>
+    </w:p>
+    <w:p>
+      <w:pPr>
+        <w:spacing w:after="100" w:line="276" w:lineRule="auto"/>
+      </w:pPr>
+      <w:r>
+        <w:rPr>
+          <w:rFonts w:ascii="Aptos" w:hAnsi="Aptos" w:eastAsia="Aptos"/>
+          <w:b w:val="0"/>
+          <w:i w:val="0"/>
+          <w:color w:val="1F2D3D"/>
+          <w:sz w:val="22"/>
+        </w:rPr>
+        <w:t>Если потратить больше плана, лишняя сумма уже уменьшит свободный остаток.</w:t>
+      </w:r>
+    </w:p>
+    <w:p>
+      <w:pPr>
+        <w:pStyle w:val="Heading1"/>
+      </w:pPr>
+      <w:r>
+        <w:t>5. Зарплата и другой доход</w:t>
+      </w:r>
+    </w:p>
+    <w:p>
+      <w:pPr>
+        <w:spacing w:after="100" w:line="276" w:lineRule="auto"/>
+      </w:pPr>
+      <w:r>
+        <w:rPr>
+          <w:rFonts w:ascii="Aptos" w:hAnsi="Aptos" w:eastAsia="Aptos"/>
+          <w:b w:val="0"/>
+          <w:i w:val="0"/>
+          <w:color w:val="1F2D3D"/>
+          <w:sz w:val="22"/>
+        </w:rPr>
+        <w:t>Сумма зарплаты хранится в выбранном периоде для справки. Когда её добавляют или изменяют, на общем счёте появляется операция дохода.</w:t>
+      </w:r>
+    </w:p>
+    <w:p>
+      <w:pPr>
+        <w:spacing w:after="100" w:line="276" w:lineRule="auto"/>
+      </w:pPr>
+      <w:r>
+        <w:rPr>
+          <w:rFonts w:ascii="Aptos" w:hAnsi="Aptos" w:eastAsia="Aptos"/>
+          <w:b w:val="0"/>
+          <w:i w:val="0"/>
+          <w:color w:val="1F2D3D"/>
+          <w:sz w:val="22"/>
+        </w:rPr>
+        <w:t>Доход не заменяет остаток на счёте. Он просто прибавляет деньги к нему.</w:t>
+      </w:r>
+    </w:p>
+    <w:p>
+      <w:pPr>
+        <w:pStyle w:val="Heading1"/>
+      </w:pPr>
+      <w:r>
+        <w:t>6. Ручная сверка счёта</w:t>
+      </w:r>
+    </w:p>
+    <w:p>
+      <w:pPr>
+        <w:spacing w:after="100" w:line="276" w:lineRule="auto"/>
+      </w:pPr>
+      <w:r>
+        <w:rPr>
+          <w:rFonts w:ascii="Aptos" w:hAnsi="Aptos" w:eastAsia="Aptos"/>
+          <w:b w:val="0"/>
+          <w:i w:val="0"/>
+          <w:color w:val="1F2D3D"/>
+          <w:sz w:val="22"/>
+        </w:rPr>
+        <w:t>Если приложение показывает 900 BYN, а в банке лежит 850 BYN, можно вручную написать 850 BYN.</w:t>
+      </w:r>
+    </w:p>
+    <w:p>
+      <w:pPr>
+        <w:spacing w:after="100" w:line="276" w:lineRule="auto"/>
+      </w:pPr>
+      <w:r>
+        <w:rPr>
+          <w:rFonts w:ascii="Aptos" w:hAnsi="Aptos" w:eastAsia="Aptos"/>
+          <w:b w:val="0"/>
+          <w:i w:val="0"/>
+          <w:color w:val="1F2D3D"/>
+          <w:sz w:val="22"/>
+        </w:rPr>
+        <w:t>Приложение не стирает историю. Оно создаёт видимую операцию:</w:t>
+      </w:r>
+    </w:p>
+    <w:p>
+      <w:pPr>
+        <w:spacing w:after="140" w:line="276" w:lineRule="auto" w:before="60"/>
+        <w:ind w:left="230" w:right="230"/>
+        <w:shd w:fill="EEF5F1"/>
+      </w:pPr>
+      <w:r>
+        <w:rPr>
+          <w:rFonts w:ascii="Aptos" w:hAnsi="Aptos" w:eastAsia="Aptos"/>
+          <w:b/>
+          <w:i w:val="0"/>
+          <w:color w:val="405B5E"/>
+          <w:sz w:val="23"/>
+        </w:rPr>
+        <w:t>Корректировка -50 BYN</w:t>
+      </w:r>
+    </w:p>
+    <w:p>
+      <w:pPr>
+        <w:spacing w:after="100" w:line="276" w:lineRule="auto"/>
+      </w:pPr>
+      <w:r>
+        <w:rPr>
+          <w:rFonts w:ascii="Aptos" w:hAnsi="Aptos" w:eastAsia="Aptos"/>
+          <w:b w:val="0"/>
+          <w:i w:val="0"/>
+          <w:color w:val="1F2D3D"/>
+          <w:sz w:val="22"/>
+        </w:rPr>
+        <w:t>После неё на счёте будет 850 BYN. Эту операцию можно увидеть и удалить.</w:t>
+      </w:r>
+    </w:p>
+    <w:p>
+      <w:pPr>
+        <w:pStyle w:val="Heading1"/>
+      </w:pPr>
+      <w:r>
+        <w:t>7. Категории и планы</w:t>
+      </w:r>
+    </w:p>
+    <w:p>
+      <w:pPr>
+        <w:spacing w:after="100" w:line="276" w:lineRule="auto"/>
+      </w:pPr>
+      <w:r>
+        <w:rPr>
+          <w:rFonts w:ascii="Aptos" w:hAnsi="Aptos" w:eastAsia="Aptos"/>
+          <w:b w:val="0"/>
+          <w:i w:val="0"/>
+          <w:color w:val="1F2D3D"/>
+          <w:sz w:val="22"/>
+        </w:rPr>
+        <w:t>Сумма категории — это план на выбранный месяц. Само заполнение плана не двигает деньги на счёте.</w:t>
+      </w:r>
+    </w:p>
+    <w:p>
+      <w:pPr>
+        <w:spacing w:after="100" w:line="276" w:lineRule="auto"/>
+      </w:pPr>
+      <w:r>
+        <w:rPr>
+          <w:rFonts w:ascii="Aptos" w:hAnsi="Aptos" w:eastAsia="Aptos"/>
+          <w:b w:val="0"/>
+          <w:i w:val="0"/>
+          <w:color w:val="1F2D3D"/>
+          <w:sz w:val="22"/>
+        </w:rPr>
+        <w:t>Когда добавляется реальная трата:</w:t>
       </w:r>
     </w:p>
     <w:p>
@@ -672,7 +813,7 @@
           <w:color w:val="1F2D3D"/>
           <w:sz w:val="22"/>
         </w:rPr>
-        <w:t>расходы всех категорий;</w:t>
+        <w:t>она попадает в выбранную категорию;</w:t>
       </w:r>
     </w:p>
     <w:p>
@@ -689,85 +830,7 @@
           <w:color w:val="1F2D3D"/>
           <w:sz w:val="22"/>
         </w:rPr>
-        <w:t>расходы на еду по всем неделям.</w:t>
-      </w:r>
-    </w:p>
-    <w:p>
-      <w:pPr>
-        <w:spacing w:after="100" w:line="276" w:lineRule="auto"/>
-      </w:pPr>
-      <w:r>
-        <w:rPr>
-          <w:rFonts w:ascii="Aptos" w:hAnsi="Aptos" w:eastAsia="Aptos"/>
-          <w:b w:val="0"/>
-          <w:i w:val="0"/>
-          <w:color w:val="1F2D3D"/>
-          <w:sz w:val="22"/>
-        </w:rPr>
-        <w:t>Если расход добавлен большой кнопкой «минус», он попадает в выбранную категорию и учитывается во всех общих расчетах.</w:t>
-      </w:r>
-    </w:p>
-    <w:p>
-      <w:pPr>
-        <w:pStyle w:val="Heading1"/>
-      </w:pPr>
-      <w:r>
-        <w:t>5. Осталось на счете</w:t>
-      </w:r>
-    </w:p>
-    <w:p>
-      <w:pPr>
-        <w:pStyle w:val="Heading2"/>
-      </w:pPr>
-      <w:r>
-        <w:t>Если число не вводили вручную</w:t>
-      </w:r>
-    </w:p>
-    <w:p>
-      <w:pPr>
-        <w:spacing w:after="100" w:line="276" w:lineRule="auto"/>
-      </w:pPr>
-      <w:r>
-        <w:rPr>
-          <w:rFonts w:ascii="Aptos" w:hAnsi="Aptos" w:eastAsia="Aptos"/>
-          <w:b w:val="0"/>
-          <w:i w:val="0"/>
-          <w:color w:val="1F2D3D"/>
-          <w:sz w:val="22"/>
-        </w:rPr>
-        <w:t>Приложение считает:</w:t>
-      </w:r>
-    </w:p>
-    <w:p>
-      <w:pPr>
-        <w:spacing w:after="140" w:line="276" w:lineRule="auto" w:before="60"/>
-        <w:ind w:left="230" w:right="230"/>
-        <w:shd w:fill="EEF5F1"/>
-      </w:pPr>
-      <w:r>
-        <w:rPr>
-          <w:rFonts w:ascii="Aptos" w:hAnsi="Aptos" w:eastAsia="Aptos"/>
-          <w:b/>
-          <w:i w:val="0"/>
-          <w:color w:val="405B5E"/>
-          <w:sz w:val="23"/>
-        </w:rPr>
-        <w:t>Доход + перенос из прошлого периода - фактические траты</w:t>
-      </w:r>
-    </w:p>
-    <w:p>
-      <w:pPr>
-        <w:spacing w:after="100" w:line="276" w:lineRule="auto"/>
-      </w:pPr>
-      <w:r>
-        <w:rPr>
-          <w:rFonts w:ascii="Aptos" w:hAnsi="Aptos" w:eastAsia="Aptos"/>
-          <w:b w:val="0"/>
-          <w:i w:val="0"/>
-          <w:color w:val="1F2D3D"/>
-          <w:sz w:val="22"/>
-        </w:rPr>
-        <w:t>Пример:</w:t>
+        <w:t>уменьшает счёт;</w:t>
       </w:r>
     </w:p>
     <w:p>
@@ -784,7 +847,113 @@
           <w:color w:val="1F2D3D"/>
           <w:sz w:val="22"/>
         </w:rPr>
-        <w:t>доход: 1 500 BYN;</w:t>
+        <w:t>уменьшает оставшуюся часть плана этой категории.</w:t>
+      </w:r>
+    </w:p>
+    <w:p>
+      <w:pPr>
+        <w:spacing w:after="100" w:line="276" w:lineRule="auto"/>
+      </w:pPr>
+      <w:r>
+        <w:rPr>
+          <w:rFonts w:ascii="Aptos" w:hAnsi="Aptos" w:eastAsia="Aptos"/>
+          <w:b w:val="0"/>
+          <w:i w:val="0"/>
+          <w:color w:val="1F2D3D"/>
+          <w:sz w:val="22"/>
+        </w:rPr>
+        <w:t>Все места приложения используют одну и ту же категорию, её название и иконку.</w:t>
+      </w:r>
+    </w:p>
+    <w:p>
+      <w:pPr>
+        <w:pStyle w:val="Heading1"/>
+      </w:pPr>
+      <w:r>
+        <w:t>8. Еда и недели</w:t>
+      </w:r>
+    </w:p>
+    <w:p>
+      <w:pPr>
+        <w:spacing w:after="100" w:line="276" w:lineRule="auto"/>
+      </w:pPr>
+      <w:r>
+        <w:rPr>
+          <w:rFonts w:ascii="Aptos" w:hAnsi="Aptos" w:eastAsia="Aptos"/>
+          <w:b w:val="0"/>
+          <w:i w:val="0"/>
+          <w:color w:val="1F2D3D"/>
+          <w:sz w:val="22"/>
+        </w:rPr>
+        <w:t>У еды есть общий план на месяц. Он делится между неделями по количеству дней.</w:t>
+      </w:r>
+    </w:p>
+    <w:p>
+      <w:pPr>
+        <w:spacing w:after="100" w:line="276" w:lineRule="auto"/>
+      </w:pPr>
+      <w:r>
+        <w:rPr>
+          <w:rFonts w:ascii="Aptos" w:hAnsi="Aptos" w:eastAsia="Aptos"/>
+          <w:b w:val="0"/>
+          <w:i w:val="0"/>
+          <w:color w:val="1F2D3D"/>
+          <w:sz w:val="22"/>
+        </w:rPr>
+        <w:t>Неделя хранит только сумму, которую нужно оставить на неё. Реальные траты добавляются обычными операциями с категорией «Еда».</w:t>
+      </w:r>
+    </w:p>
+    <w:p>
+      <w:pPr>
+        <w:spacing w:after="100" w:line="276" w:lineRule="auto"/>
+      </w:pPr>
+      <w:r>
+        <w:rPr>
+          <w:rFonts w:ascii="Aptos" w:hAnsi="Aptos" w:eastAsia="Aptos"/>
+          <w:b w:val="0"/>
+          <w:i w:val="0"/>
+          <w:color w:val="1F2D3D"/>
+          <w:sz w:val="22"/>
+        </w:rPr>
+        <w:t>В понедельник в 00:00 прошлая неделя закрывается автоматически. Неиспользованный план закрытой недели больше не считается занятым.</w:t>
+      </w:r>
+    </w:p>
+    <w:p>
+      <w:pPr>
+        <w:pStyle w:val="Heading1"/>
+      </w:pPr>
+      <w:r>
+        <w:t>9. Отдельные конверты</w:t>
+      </w:r>
+    </w:p>
+    <w:p>
+      <w:pPr>
+        <w:spacing w:after="100" w:line="276" w:lineRule="auto"/>
+      </w:pPr>
+      <w:r>
+        <w:rPr>
+          <w:rFonts w:ascii="Aptos" w:hAnsi="Aptos" w:eastAsia="Aptos"/>
+          <w:b w:val="0"/>
+          <w:i w:val="0"/>
+          <w:color w:val="1F2D3D"/>
+          <w:sz w:val="22"/>
+        </w:rPr>
+        <w:t>Накопления, подушка безопасности, баланс питомца и подарки — отдельные конверты.</w:t>
+      </w:r>
+    </w:p>
+    <w:p>
+      <w:pPr>
+        <w:spacing w:after="100" w:line="276" w:lineRule="auto"/>
+      </w:pPr>
+      <w:r>
+        <w:rPr>
+          <w:rFonts w:ascii="Aptos" w:hAnsi="Aptos" w:eastAsia="Aptos"/>
+          <w:b w:val="0"/>
+          <w:i w:val="0"/>
+          <w:color w:val="1F2D3D"/>
+          <w:sz w:val="22"/>
+        </w:rPr>
+        <w:t>Пополнение конверта — это перевод:</w:t>
       </w:r>
     </w:p>
     <w:p>
@@ -801,7 +970,7 @@
           <w:color w:val="1F2D3D"/>
           <w:sz w:val="22"/>
         </w:rPr>
-        <w:t>из прошлого периода перешло: 100 BYN;</w:t>
+        <w:t>на обычном счёте денег становится меньше;</w:t>
       </w:r>
     </w:p>
     <w:p>
@@ -818,7 +987,75 @@
           <w:color w:val="1F2D3D"/>
           <w:sz w:val="22"/>
         </w:rPr>
-        <w:t>уже потрачено: 450 BYN;</w:t>
+        <w:t>в выбранном конверте денег становится больше.</w:t>
+      </w:r>
+    </w:p>
+    <w:p>
+      <w:pPr>
+        <w:spacing w:after="100" w:line="276" w:lineRule="auto"/>
+      </w:pPr>
+      <w:r>
+        <w:rPr>
+          <w:rFonts w:ascii="Aptos" w:hAnsi="Aptos" w:eastAsia="Aptos"/>
+          <w:b w:val="0"/>
+          <w:i w:val="0"/>
+          <w:color w:val="1F2D3D"/>
+          <w:sz w:val="22"/>
+        </w:rPr>
+        <w:t>Возврат работает наоборот.</w:t>
+      </w:r>
+    </w:p>
+    <w:p>
+      <w:pPr>
+        <w:spacing w:after="100" w:line="276" w:lineRule="auto"/>
+      </w:pPr>
+      <w:r>
+        <w:rPr>
+          <w:rFonts w:ascii="Aptos" w:hAnsi="Aptos" w:eastAsia="Aptos"/>
+          <w:b w:val="0"/>
+          <w:i w:val="0"/>
+          <w:color w:val="1F2D3D"/>
+          <w:sz w:val="22"/>
+        </w:rPr>
+        <w:t>Трата из уже пополненного конверта уменьшает только этот конверт. Она не списывает деньги с обычного счёта второй раз.</w:t>
+      </w:r>
+    </w:p>
+    <w:p>
+      <w:pPr>
+        <w:pStyle w:val="Heading1"/>
+      </w:pPr>
+      <w:r>
+        <w:t>10. Накопления и валюты</w:t>
+      </w:r>
+    </w:p>
+    <w:p>
+      <w:pPr>
+        <w:spacing w:after="100" w:line="276" w:lineRule="auto"/>
+      </w:pPr>
+      <w:r>
+        <w:rPr>
+          <w:rFonts w:ascii="Aptos" w:hAnsi="Aptos" w:eastAsia="Aptos"/>
+          <w:b w:val="0"/>
+          <w:i w:val="0"/>
+          <w:color w:val="1F2D3D"/>
+          <w:sz w:val="22"/>
+        </w:rPr>
+        <w:t>BYN и USD хранятся отдельно. Приложение не угадывает курс.</w:t>
+      </w:r>
+    </w:p>
+    <w:p>
+      <w:pPr>
+        <w:spacing w:after="100" w:line="276" w:lineRule="auto"/>
+      </w:pPr>
+      <w:r>
+        <w:rPr>
+          <w:rFonts w:ascii="Aptos" w:hAnsi="Aptos" w:eastAsia="Aptos"/>
+          <w:b w:val="0"/>
+          <w:i w:val="0"/>
+          <w:color w:val="1F2D3D"/>
+          <w:sz w:val="22"/>
+        </w:rPr>
+        <w:t>При переводе в USD пользователь указывает:</w:t>
       </w:r>
     </w:p>
     <w:p>
@@ -835,60 +1072,7 @@
           <w:color w:val="1F2D3D"/>
           <w:sz w:val="22"/>
         </w:rPr>
-        <w:t>осталось на счете: 1 150 BYN.</w:t>
-      </w:r>
-    </w:p>
-    <w:p>
-      <w:pPr>
-        <w:pStyle w:val="Heading2"/>
-      </w:pPr>
-      <w:r>
-        <w:t>Если число ввели вручную</w:t>
-      </w:r>
-    </w:p>
-    <w:p>
-      <w:pPr>
-        <w:spacing w:after="100" w:line="276" w:lineRule="auto"/>
-      </w:pPr>
-      <w:r>
-        <w:rPr>
-          <w:rFonts w:ascii="Aptos" w:hAnsi="Aptos" w:eastAsia="Aptos"/>
-          <w:b w:val="0"/>
-          <w:i w:val="0"/>
-          <w:color w:val="1F2D3D"/>
-          <w:sz w:val="22"/>
-        </w:rPr>
-        <w:t>Ручное число становится главным. Приложение запоминает, сколько уже было потрачено в момент ввода.</w:t>
-      </w:r>
-    </w:p>
-    <w:p>
-      <w:pPr>
-        <w:spacing w:after="100" w:line="276" w:lineRule="auto"/>
-      </w:pPr>
-      <w:r>
-        <w:rPr>
-          <w:rFonts w:ascii="Aptos" w:hAnsi="Aptos" w:eastAsia="Aptos"/>
-          <w:b w:val="0"/>
-          <w:i w:val="0"/>
-          <w:color w:val="1F2D3D"/>
-          <w:sz w:val="22"/>
-        </w:rPr>
-        <w:t>После этого оно отнимает только новые траты.</w:t>
-      </w:r>
-    </w:p>
-    <w:p>
-      <w:pPr>
-        <w:spacing w:after="100" w:line="276" w:lineRule="auto"/>
-      </w:pPr>
-      <w:r>
-        <w:rPr>
-          <w:rFonts w:ascii="Aptos" w:hAnsi="Aptos" w:eastAsia="Aptos"/>
-          <w:b w:val="0"/>
-          <w:i w:val="0"/>
-          <w:color w:val="1F2D3D"/>
-          <w:sz w:val="22"/>
-        </w:rPr>
-        <w:t>Пример:</w:t>
+        <w:t>сколько USD добавлено в накопления;</w:t>
       </w:r>
     </w:p>
     <w:p>
@@ -905,75 +1089,7 @@
           <w:color w:val="1F2D3D"/>
           <w:sz w:val="22"/>
         </w:rPr>
-        <w:t>вы вручную написали: «На счете 800 BYN»;</w:t>
-      </w:r>
-    </w:p>
-    <w:p>
-      <w:pPr>
-        <w:pStyle w:val="ListBullet"/>
-        <w:spacing w:after="60" w:line="269" w:lineRule="auto"/>
-        <w:ind w:left="403" w:hanging="230"/>
-      </w:pPr>
-      <w:r>
-        <w:rPr>
-          <w:rFonts w:ascii="Aptos" w:hAnsi="Aptos" w:eastAsia="Aptos"/>
-          <w:b w:val="0"/>
-          <w:i w:val="0"/>
-          <w:color w:val="1F2D3D"/>
-          <w:sz w:val="22"/>
-        </w:rPr>
-        <w:t>до этого приложение уже знало о тратах на 300 BYN;</w:t>
-      </w:r>
-    </w:p>
-    <w:p>
-      <w:pPr>
-        <w:pStyle w:val="ListBullet"/>
-        <w:spacing w:after="60" w:line="269" w:lineRule="auto"/>
-        <w:ind w:left="403" w:hanging="230"/>
-      </w:pPr>
-      <w:r>
-        <w:rPr>
-          <w:rFonts w:ascii="Aptos" w:hAnsi="Aptos" w:eastAsia="Aptos"/>
-          <w:b w:val="0"/>
-          <w:i w:val="0"/>
-          <w:color w:val="1F2D3D"/>
-          <w:sz w:val="22"/>
-        </w:rPr>
-        <w:t>старые 300 BYN второй раз не отнимаются;</w:t>
-      </w:r>
-    </w:p>
-    <w:p>
-      <w:pPr>
-        <w:pStyle w:val="ListBullet"/>
-        <w:spacing w:after="60" w:line="269" w:lineRule="auto"/>
-        <w:ind w:left="403" w:hanging="230"/>
-      </w:pPr>
-      <w:r>
-        <w:rPr>
-          <w:rFonts w:ascii="Aptos" w:hAnsi="Aptos" w:eastAsia="Aptos"/>
-          <w:b w:val="0"/>
-          <w:i w:val="0"/>
-          <w:color w:val="1F2D3D"/>
-          <w:sz w:val="22"/>
-        </w:rPr>
-        <w:t>потом вы добавили новую покупку на 50 BYN;</w:t>
-      </w:r>
-    </w:p>
-    <w:p>
-      <w:pPr>
-        <w:pStyle w:val="ListBullet"/>
-        <w:spacing w:after="60" w:line="269" w:lineRule="auto"/>
-        <w:ind w:left="403" w:hanging="230"/>
-      </w:pPr>
-      <w:r>
-        <w:rPr>
-          <w:rFonts w:ascii="Aptos" w:hAnsi="Aptos" w:eastAsia="Aptos"/>
-          <w:b w:val="0"/>
-          <w:i w:val="0"/>
-          <w:color w:val="1F2D3D"/>
-          <w:sz w:val="22"/>
-        </w:rPr>
-        <w:t>приложение покажет 750 BYN.</w:t>
+        <w:t>сколько BYN действительно ушло с обычного счёта.</w:t>
       </w:r>
     </w:p>
     <w:p>
@@ -988,15 +1104,7 @@
           <w:color w:val="1F2D3D"/>
           <w:sz w:val="22"/>
         </w:rPr>
-        <w:t>Изменение зарплаты не отменяет вручную введенный остаток.</w:t>
-      </w:r>
-    </w:p>
-    <w:p>
-      <w:pPr>
-        <w:pStyle w:val="Heading1"/>
-      </w:pPr>
-      <w:r>
-        <w:t>6. Свободный остаток</w:t>
+        <w:t>По этим двум числам приложение запоминает фактический курс обмена.</w:t>
       </w:r>
     </w:p>
     <w:p>
@@ -1011,1003 +1119,7 @@
           <w:color w:val="1F2D3D"/>
           <w:sz w:val="22"/>
         </w:rPr>
-        <w:t>Свободный остаток отвечает на вопрос:</w:t>
-      </w:r>
-    </w:p>
-    <w:p>
-      <w:pPr>
-        <w:spacing w:after="140" w:line="276" w:lineRule="auto" w:before="60"/>
-        <w:ind w:left="230" w:right="230"/>
-        <w:shd w:fill="EEF5F1"/>
-      </w:pPr>
-      <w:r>
-        <w:rPr>
-          <w:rFonts w:ascii="Aptos" w:hAnsi="Aptos" w:eastAsia="Aptos"/>
-          <w:b/>
-          <w:i w:val="0"/>
-          <w:color w:val="405B5E"/>
-          <w:sz w:val="23"/>
-        </w:rPr>
-        <w:t>«Сколько денег я могу потратить на что угодно, не забрав деньги у уже намеченных дел?»</w:t>
-      </w:r>
-    </w:p>
-    <w:p>
-      <w:pPr>
-        <w:spacing w:after="100" w:line="276" w:lineRule="auto"/>
-      </w:pPr>
-      <w:r>
-        <w:rPr>
-          <w:rFonts w:ascii="Aptos" w:hAnsi="Aptos" w:eastAsia="Aptos"/>
-          <w:b w:val="0"/>
-          <w:i w:val="0"/>
-          <w:color w:val="1F2D3D"/>
-          <w:sz w:val="22"/>
-        </w:rPr>
-        <w:t>В простом случае приложение считает:</w:t>
-      </w:r>
-    </w:p>
-    <w:p>
-      <w:pPr>
-        <w:spacing w:after="140" w:line="276" w:lineRule="auto" w:before="60"/>
-        <w:ind w:left="230" w:right="230"/>
-        <w:shd w:fill="EEF5F1"/>
-      </w:pPr>
-      <w:r>
-        <w:rPr>
-          <w:rFonts w:ascii="Aptos" w:hAnsi="Aptos" w:eastAsia="Aptos"/>
-          <w:b/>
-          <w:i w:val="0"/>
-          <w:color w:val="405B5E"/>
-          <w:sz w:val="23"/>
-        </w:rPr>
-        <w:t>Доход + перенос - все планы на период</w:t>
-      </w:r>
-    </w:p>
-    <w:p>
-      <w:pPr>
-        <w:spacing w:after="100" w:line="276" w:lineRule="auto"/>
-      </w:pPr>
-      <w:r>
-        <w:rPr>
-          <w:rFonts w:ascii="Aptos" w:hAnsi="Aptos" w:eastAsia="Aptos"/>
-          <w:b w:val="0"/>
-          <w:i w:val="0"/>
-          <w:color w:val="1F2D3D"/>
-          <w:sz w:val="22"/>
-        </w:rPr>
-        <w:t>Из суммы вычитаются планы на:</w:t>
-      </w:r>
-    </w:p>
-    <w:p>
-      <w:pPr>
-        <w:pStyle w:val="ListBullet"/>
-        <w:spacing w:after="60" w:line="269" w:lineRule="auto"/>
-        <w:ind w:left="403" w:hanging="230"/>
-      </w:pPr>
-      <w:r>
-        <w:rPr>
-          <w:rFonts w:ascii="Aptos" w:hAnsi="Aptos" w:eastAsia="Aptos"/>
-          <w:b w:val="0"/>
-          <w:i w:val="0"/>
-          <w:color w:val="1F2D3D"/>
-          <w:sz w:val="22"/>
-        </w:rPr>
-        <w:t>квартиру;</w:t>
-      </w:r>
-    </w:p>
-    <w:p>
-      <w:pPr>
-        <w:pStyle w:val="ListBullet"/>
-        <w:spacing w:after="60" w:line="269" w:lineRule="auto"/>
-        <w:ind w:left="403" w:hanging="230"/>
-      </w:pPr>
-      <w:r>
-        <w:rPr>
-          <w:rFonts w:ascii="Aptos" w:hAnsi="Aptos" w:eastAsia="Aptos"/>
-          <w:b w:val="0"/>
-          <w:i w:val="0"/>
-          <w:color w:val="1F2D3D"/>
-          <w:sz w:val="22"/>
-        </w:rPr>
-        <w:t>выбранные обязательные платежи;</w:t>
-      </w:r>
-    </w:p>
-    <w:p>
-      <w:pPr>
-        <w:pStyle w:val="ListBullet"/>
-        <w:spacing w:after="60" w:line="269" w:lineRule="auto"/>
-        <w:ind w:left="403" w:hanging="230"/>
-      </w:pPr>
-      <w:r>
-        <w:rPr>
-          <w:rFonts w:ascii="Aptos" w:hAnsi="Aptos" w:eastAsia="Aptos"/>
-          <w:b w:val="0"/>
-          <w:i w:val="0"/>
-          <w:color w:val="1F2D3D"/>
-          <w:sz w:val="22"/>
-        </w:rPr>
-        <w:t>резерв;</w:t>
-      </w:r>
-    </w:p>
-    <w:p>
-      <w:pPr>
-        <w:pStyle w:val="ListBullet"/>
-        <w:spacing w:after="60" w:line="269" w:lineRule="auto"/>
-        <w:ind w:left="403" w:hanging="230"/>
-      </w:pPr>
-      <w:r>
-        <w:rPr>
-          <w:rFonts w:ascii="Aptos" w:hAnsi="Aptos" w:eastAsia="Aptos"/>
-          <w:b w:val="0"/>
-          <w:i w:val="0"/>
-          <w:color w:val="1F2D3D"/>
-          <w:sz w:val="22"/>
-        </w:rPr>
-        <w:t>пополнение накоплений;</w:t>
-      </w:r>
-    </w:p>
-    <w:p>
-      <w:pPr>
-        <w:pStyle w:val="ListBullet"/>
-        <w:spacing w:after="60" w:line="269" w:lineRule="auto"/>
-        <w:ind w:left="403" w:hanging="230"/>
-      </w:pPr>
-      <w:r>
-        <w:rPr>
-          <w:rFonts w:ascii="Aptos" w:hAnsi="Aptos" w:eastAsia="Aptos"/>
-          <w:b w:val="0"/>
-          <w:i w:val="0"/>
-          <w:color w:val="1F2D3D"/>
-          <w:sz w:val="22"/>
-        </w:rPr>
-        <w:t>еду;</w:t>
-      </w:r>
-    </w:p>
-    <w:p>
-      <w:pPr>
-        <w:pStyle w:val="ListBullet"/>
-        <w:spacing w:after="60" w:line="269" w:lineRule="auto"/>
-        <w:ind w:left="403" w:hanging="230"/>
-      </w:pPr>
-      <w:r>
-        <w:rPr>
-          <w:rFonts w:ascii="Aptos" w:hAnsi="Aptos" w:eastAsia="Aptos"/>
-          <w:b w:val="0"/>
-          <w:i w:val="0"/>
-          <w:color w:val="1F2D3D"/>
-          <w:sz w:val="22"/>
-        </w:rPr>
-        <w:t>все видимые категории.</w:t>
-      </w:r>
-    </w:p>
-    <w:p>
-      <w:pPr>
-        <w:spacing w:after="100" w:line="276" w:lineRule="auto"/>
-      </w:pPr>
-      <w:r>
-        <w:rPr>
-          <w:rFonts w:ascii="Aptos" w:hAnsi="Aptos" w:eastAsia="Aptos"/>
-          <w:b w:val="0"/>
-          <w:i w:val="0"/>
-          <w:color w:val="1F2D3D"/>
-          <w:sz w:val="22"/>
-        </w:rPr>
-        <w:t>Пример:</w:t>
-      </w:r>
-    </w:p>
-    <w:p>
-      <w:pPr>
-        <w:pStyle w:val="ListBullet"/>
-        <w:spacing w:after="60" w:line="269" w:lineRule="auto"/>
-        <w:ind w:left="403" w:hanging="230"/>
-      </w:pPr>
-      <w:r>
-        <w:rPr>
-          <w:rFonts w:ascii="Aptos" w:hAnsi="Aptos" w:eastAsia="Aptos"/>
-          <w:b w:val="0"/>
-          <w:i w:val="0"/>
-          <w:color w:val="1F2D3D"/>
-          <w:sz w:val="22"/>
-        </w:rPr>
-        <w:t>доход: 1 500 BYN;</w:t>
-      </w:r>
-    </w:p>
-    <w:p>
-      <w:pPr>
-        <w:pStyle w:val="ListBullet"/>
-        <w:spacing w:after="60" w:line="269" w:lineRule="auto"/>
-        <w:ind w:left="403" w:hanging="230"/>
-      </w:pPr>
-      <w:r>
-        <w:rPr>
-          <w:rFonts w:ascii="Aptos" w:hAnsi="Aptos" w:eastAsia="Aptos"/>
-          <w:b w:val="0"/>
-          <w:i w:val="0"/>
-          <w:color w:val="1F2D3D"/>
-          <w:sz w:val="22"/>
-        </w:rPr>
-        <w:t>квартира: 500 BYN;</w:t>
-      </w:r>
-    </w:p>
-    <w:p>
-      <w:pPr>
-        <w:pStyle w:val="ListBullet"/>
-        <w:spacing w:after="60" w:line="269" w:lineRule="auto"/>
-        <w:ind w:left="403" w:hanging="230"/>
-      </w:pPr>
-      <w:r>
-        <w:rPr>
-          <w:rFonts w:ascii="Aptos" w:hAnsi="Aptos" w:eastAsia="Aptos"/>
-          <w:b w:val="0"/>
-          <w:i w:val="0"/>
-          <w:color w:val="1F2D3D"/>
-          <w:sz w:val="22"/>
-        </w:rPr>
-        <w:t>еда: 400 BYN;</w:t>
-      </w:r>
-    </w:p>
-    <w:p>
-      <w:pPr>
-        <w:pStyle w:val="ListBullet"/>
-        <w:spacing w:after="60" w:line="269" w:lineRule="auto"/>
-        <w:ind w:left="403" w:hanging="230"/>
-      </w:pPr>
-      <w:r>
-        <w:rPr>
-          <w:rFonts w:ascii="Aptos" w:hAnsi="Aptos" w:eastAsia="Aptos"/>
-          <w:b w:val="0"/>
-          <w:i w:val="0"/>
-          <w:color w:val="1F2D3D"/>
-          <w:sz w:val="22"/>
-        </w:rPr>
-        <w:t>другие планы: 200 BYN;</w:t>
-      </w:r>
-    </w:p>
-    <w:p>
-      <w:pPr>
-        <w:pStyle w:val="ListBullet"/>
-        <w:spacing w:after="60" w:line="269" w:lineRule="auto"/>
-        <w:ind w:left="403" w:hanging="230"/>
-      </w:pPr>
-      <w:r>
-        <w:rPr>
-          <w:rFonts w:ascii="Aptos" w:hAnsi="Aptos" w:eastAsia="Aptos"/>
-          <w:b w:val="0"/>
-          <w:i w:val="0"/>
-          <w:color w:val="1F2D3D"/>
-          <w:sz w:val="22"/>
-        </w:rPr>
-        <w:t>свободный остаток: 400 BYN.</w:t>
-      </w:r>
-    </w:p>
-    <w:p>
-      <w:pPr>
-        <w:pStyle w:val="Heading2"/>
-      </w:pPr>
-      <w:r>
-        <w:t>Почему обычная трата не всегда уменьшает свободный остаток</w:t>
-      </w:r>
-    </w:p>
-    <w:p>
-      <w:pPr>
-        <w:spacing w:after="100" w:line="276" w:lineRule="auto"/>
-      </w:pPr>
-      <w:r>
-        <w:rPr>
-          <w:rFonts w:ascii="Aptos" w:hAnsi="Aptos" w:eastAsia="Aptos"/>
-          <w:b w:val="0"/>
-          <w:i w:val="0"/>
-          <w:color w:val="1F2D3D"/>
-          <w:sz w:val="22"/>
-        </w:rPr>
-        <w:t>Если трата уже была запланирована, свободные деньги были уменьшены заранее.</w:t>
-      </w:r>
-    </w:p>
-    <w:p>
-      <w:pPr>
-        <w:spacing w:after="100" w:line="276" w:lineRule="auto"/>
-      </w:pPr>
-      <w:r>
-        <w:rPr>
-          <w:rFonts w:ascii="Aptos" w:hAnsi="Aptos" w:eastAsia="Aptos"/>
-          <w:b w:val="0"/>
-          <w:i w:val="0"/>
-          <w:color w:val="1F2D3D"/>
-          <w:sz w:val="22"/>
-        </w:rPr>
-        <w:t>Пример:</w:t>
-      </w:r>
-    </w:p>
-    <w:p>
-      <w:pPr>
-        <w:pStyle w:val="ListBullet"/>
-        <w:spacing w:after="60" w:line="269" w:lineRule="auto"/>
-        <w:ind w:left="403" w:hanging="230"/>
-      </w:pPr>
-      <w:r>
-        <w:rPr>
-          <w:rFonts w:ascii="Aptos" w:hAnsi="Aptos" w:eastAsia="Aptos"/>
-          <w:b w:val="0"/>
-          <w:i w:val="0"/>
-          <w:color w:val="1F2D3D"/>
-          <w:sz w:val="22"/>
-        </w:rPr>
-        <w:t>на еду запланировано 400 BYN;</w:t>
-      </w:r>
-    </w:p>
-    <w:p>
-      <w:pPr>
-        <w:pStyle w:val="ListBullet"/>
-        <w:spacing w:after="60" w:line="269" w:lineRule="auto"/>
-        <w:ind w:left="403" w:hanging="230"/>
-      </w:pPr>
-      <w:r>
-        <w:rPr>
-          <w:rFonts w:ascii="Aptos" w:hAnsi="Aptos" w:eastAsia="Aptos"/>
-          <w:b w:val="0"/>
-          <w:i w:val="0"/>
-          <w:color w:val="1F2D3D"/>
-          <w:sz w:val="22"/>
-        </w:rPr>
-        <w:t>свободный остаток уже посчитан без этих 400 BYN;</w:t>
-      </w:r>
-    </w:p>
-    <w:p>
-      <w:pPr>
-        <w:pStyle w:val="ListBullet"/>
-        <w:spacing w:after="60" w:line="269" w:lineRule="auto"/>
-        <w:ind w:left="403" w:hanging="230"/>
-      </w:pPr>
-      <w:r>
-        <w:rPr>
-          <w:rFonts w:ascii="Aptos" w:hAnsi="Aptos" w:eastAsia="Aptos"/>
-          <w:b w:val="0"/>
-          <w:i w:val="0"/>
-          <w:color w:val="1F2D3D"/>
-          <w:sz w:val="22"/>
-        </w:rPr>
-        <w:t>вы потратили 100 BYN на еду;</w:t>
-      </w:r>
-    </w:p>
-    <w:p>
-      <w:pPr>
-        <w:pStyle w:val="ListBullet"/>
-        <w:spacing w:after="60" w:line="269" w:lineRule="auto"/>
-        <w:ind w:left="403" w:hanging="230"/>
-      </w:pPr>
-      <w:r>
-        <w:rPr>
-          <w:rFonts w:ascii="Aptos" w:hAnsi="Aptos" w:eastAsia="Aptos"/>
-          <w:b w:val="0"/>
-          <w:i w:val="0"/>
-          <w:color w:val="1F2D3D"/>
-          <w:sz w:val="22"/>
-        </w:rPr>
-        <w:t>свободный остаток не уменьшается еще на 100 BYN, потому что получится двойное вычитание.</w:t>
-      </w:r>
-    </w:p>
-    <w:p>
-      <w:pPr>
-        <w:pStyle w:val="Heading2"/>
-      </w:pPr>
-      <w:r>
-        <w:t>Когда свободный остаток уменьшается</w:t>
-      </w:r>
-    </w:p>
-    <w:p>
-      <w:pPr>
-        <w:spacing w:after="100" w:line="276" w:lineRule="auto"/>
-      </w:pPr>
-      <w:r>
-        <w:rPr>
-          <w:rFonts w:ascii="Aptos" w:hAnsi="Aptos" w:eastAsia="Aptos"/>
-          <w:b w:val="0"/>
-          <w:i w:val="0"/>
-          <w:color w:val="1F2D3D"/>
-          <w:sz w:val="22"/>
-        </w:rPr>
-        <w:t>Он уменьшается, если вы потратили больше плана.</w:t>
-      </w:r>
-    </w:p>
-    <w:p>
-      <w:pPr>
-        <w:spacing w:after="100" w:line="276" w:lineRule="auto"/>
-      </w:pPr>
-      <w:r>
-        <w:rPr>
-          <w:rFonts w:ascii="Aptos" w:hAnsi="Aptos" w:eastAsia="Aptos"/>
-          <w:b w:val="0"/>
-          <w:i w:val="0"/>
-          <w:color w:val="1F2D3D"/>
-          <w:sz w:val="22"/>
-        </w:rPr>
-        <w:t>Пример:</w:t>
-      </w:r>
-    </w:p>
-    <w:p>
-      <w:pPr>
-        <w:pStyle w:val="ListBullet"/>
-        <w:spacing w:after="60" w:line="269" w:lineRule="auto"/>
-        <w:ind w:left="403" w:hanging="230"/>
-      </w:pPr>
-      <w:r>
-        <w:rPr>
-          <w:rFonts w:ascii="Aptos" w:hAnsi="Aptos" w:eastAsia="Aptos"/>
-          <w:b w:val="0"/>
-          <w:i w:val="0"/>
-          <w:color w:val="1F2D3D"/>
-          <w:sz w:val="22"/>
-        </w:rPr>
-        <w:t>на категорию запланировано 200 BYN;</w:t>
-      </w:r>
-    </w:p>
-    <w:p>
-      <w:pPr>
-        <w:pStyle w:val="ListBullet"/>
-        <w:spacing w:after="60" w:line="269" w:lineRule="auto"/>
-        <w:ind w:left="403" w:hanging="230"/>
-      </w:pPr>
-      <w:r>
-        <w:rPr>
-          <w:rFonts w:ascii="Aptos" w:hAnsi="Aptos" w:eastAsia="Aptos"/>
-          <w:b w:val="0"/>
-          <w:i w:val="0"/>
-          <w:color w:val="1F2D3D"/>
-          <w:sz w:val="22"/>
-        </w:rPr>
-        <w:t>потрачено 250 BYN;</w:t>
-      </w:r>
-    </w:p>
-    <w:p>
-      <w:pPr>
-        <w:pStyle w:val="ListBullet"/>
-        <w:spacing w:after="60" w:line="269" w:lineRule="auto"/>
-        <w:ind w:left="403" w:hanging="230"/>
-      </w:pPr>
-      <w:r>
-        <w:rPr>
-          <w:rFonts w:ascii="Aptos" w:hAnsi="Aptos" w:eastAsia="Aptos"/>
-          <w:b w:val="0"/>
-          <w:i w:val="0"/>
-          <w:color w:val="1F2D3D"/>
-          <w:sz w:val="22"/>
-        </w:rPr>
-        <w:t>лишние 50 BYN отнимаются от свободного остатка.</w:t>
-      </w:r>
-    </w:p>
-    <w:p>
-      <w:pPr>
-        <w:pStyle w:val="Heading2"/>
-      </w:pPr>
-      <w:r>
-        <w:t>Если «Осталось на счете» введено вручную</w:t>
-      </w:r>
-    </w:p>
-    <w:p>
-      <w:pPr>
-        <w:spacing w:after="100" w:line="276" w:lineRule="auto"/>
-      </w:pPr>
-      <w:r>
-        <w:rPr>
-          <w:rFonts w:ascii="Aptos" w:hAnsi="Aptos" w:eastAsia="Aptos"/>
-          <w:b w:val="0"/>
-          <w:i w:val="0"/>
-          <w:color w:val="1F2D3D"/>
-          <w:sz w:val="22"/>
-        </w:rPr>
-        <w:t>Тогда приложение считает:</w:t>
-      </w:r>
-    </w:p>
-    <w:p>
-      <w:pPr>
-        <w:spacing w:after="140" w:line="276" w:lineRule="auto" w:before="60"/>
-        <w:ind w:left="230" w:right="230"/>
-        <w:shd w:fill="EEF5F1"/>
-      </w:pPr>
-      <w:r>
-        <w:rPr>
-          <w:rFonts w:ascii="Aptos" w:hAnsi="Aptos" w:eastAsia="Aptos"/>
-          <w:b/>
-          <w:i w:val="0"/>
-          <w:color w:val="405B5E"/>
-          <w:sz w:val="23"/>
-        </w:rPr>
-        <w:t>Ручной остаток - еще не выполненные планы - новые траты после ручного ввода</w:t>
-      </w:r>
-    </w:p>
-    <w:p>
-      <w:pPr>
-        <w:spacing w:after="100" w:line="276" w:lineRule="auto"/>
-      </w:pPr>
-      <w:r>
-        <w:rPr>
-          <w:rFonts w:ascii="Aptos" w:hAnsi="Aptos" w:eastAsia="Aptos"/>
-          <w:b w:val="0"/>
-          <w:i w:val="0"/>
-          <w:color w:val="1F2D3D"/>
-          <w:sz w:val="22"/>
-        </w:rPr>
-        <w:t>Так ручное число остается главным, но будущие обязательства все равно резервируются.</w:t>
-      </w:r>
-    </w:p>
-    <w:p>
-      <w:pPr>
-        <w:pStyle w:val="Heading1"/>
-      </w:pPr>
-      <w:r>
-        <w:t>7. Что происходит с планом еды</w:t>
-      </w:r>
-    </w:p>
-    <w:p>
-      <w:pPr>
-        <w:spacing w:after="100" w:line="276" w:lineRule="auto"/>
-      </w:pPr>
-      <w:r>
-        <w:rPr>
-          <w:rFonts w:ascii="Aptos" w:hAnsi="Aptos" w:eastAsia="Aptos"/>
-          <w:b w:val="0"/>
-          <w:i w:val="0"/>
-          <w:color w:val="1F2D3D"/>
-          <w:sz w:val="22"/>
-        </w:rPr>
-        <w:t>Общую сумму еды можно указать на месяц. Приложение делит ее между неделями по количеству дней.</w:t>
-      </w:r>
-    </w:p>
-    <w:p>
-      <w:pPr>
-        <w:spacing w:after="100" w:line="276" w:lineRule="auto"/>
-      </w:pPr>
-      <w:r>
-        <w:rPr>
-          <w:rFonts w:ascii="Aptos" w:hAnsi="Aptos" w:eastAsia="Aptos"/>
-          <w:b w:val="0"/>
-          <w:i w:val="0"/>
-          <w:color w:val="1F2D3D"/>
-          <w:sz w:val="22"/>
-        </w:rPr>
-        <w:t>Пока неделя открыта:</w:t>
-      </w:r>
-    </w:p>
-    <w:p>
-      <w:pPr>
-        <w:pStyle w:val="ListBullet"/>
-        <w:spacing w:after="60" w:line="269" w:lineRule="auto"/>
-        <w:ind w:left="403" w:hanging="230"/>
-      </w:pPr>
-      <w:r>
-        <w:rPr>
-          <w:rFonts w:ascii="Aptos" w:hAnsi="Aptos" w:eastAsia="Aptos"/>
-          <w:b w:val="0"/>
-          <w:i w:val="0"/>
-          <w:color w:val="1F2D3D"/>
-          <w:sz w:val="22"/>
-        </w:rPr>
-        <w:t>неиспользованная часть плана остается занятой;</w:t>
-      </w:r>
-    </w:p>
-    <w:p>
-      <w:pPr>
-        <w:pStyle w:val="ListBullet"/>
-        <w:spacing w:after="60" w:line="269" w:lineRule="auto"/>
-        <w:ind w:left="403" w:hanging="230"/>
-      </w:pPr>
-      <w:r>
-        <w:rPr>
-          <w:rFonts w:ascii="Aptos" w:hAnsi="Aptos" w:eastAsia="Aptos"/>
-          <w:b w:val="0"/>
-          <w:i w:val="0"/>
-          <w:color w:val="1F2D3D"/>
-          <w:sz w:val="22"/>
-        </w:rPr>
-        <w:t>перерасход уменьшает свободный остаток.</w:t>
-      </w:r>
-    </w:p>
-    <w:p>
-      <w:pPr>
-        <w:spacing w:after="100" w:line="276" w:lineRule="auto"/>
-      </w:pPr>
-      <w:r>
-        <w:rPr>
-          <w:rFonts w:ascii="Aptos" w:hAnsi="Aptos" w:eastAsia="Aptos"/>
-          <w:b w:val="0"/>
-          <w:i w:val="0"/>
-          <w:color w:val="1F2D3D"/>
-          <w:sz w:val="22"/>
-        </w:rPr>
-        <w:t>Когда неделя закрывается автоматически:</w:t>
-      </w:r>
-    </w:p>
-    <w:p>
-      <w:pPr>
-        <w:pStyle w:val="ListBullet"/>
-        <w:spacing w:after="60" w:line="269" w:lineRule="auto"/>
-        <w:ind w:left="403" w:hanging="230"/>
-      </w:pPr>
-      <w:r>
-        <w:rPr>
-          <w:rFonts w:ascii="Aptos" w:hAnsi="Aptos" w:eastAsia="Aptos"/>
-          <w:b w:val="0"/>
-          <w:i w:val="0"/>
-          <w:color w:val="1F2D3D"/>
-          <w:sz w:val="22"/>
-        </w:rPr>
-        <w:t>неиспользованная часть плана освобождается;</w:t>
-      </w:r>
-    </w:p>
-    <w:p>
-      <w:pPr>
-        <w:pStyle w:val="ListBullet"/>
-        <w:spacing w:after="60" w:line="269" w:lineRule="auto"/>
-        <w:ind w:left="403" w:hanging="230"/>
-      </w:pPr>
-      <w:r>
-        <w:rPr>
-          <w:rFonts w:ascii="Aptos" w:hAnsi="Aptos" w:eastAsia="Aptos"/>
-          <w:b w:val="0"/>
-          <w:i w:val="0"/>
-          <w:color w:val="1F2D3D"/>
-          <w:sz w:val="22"/>
-        </w:rPr>
-        <w:t>она снова становится частью свободного остатка.</w:t>
-      </w:r>
-    </w:p>
-    <w:p>
-      <w:pPr>
-        <w:spacing w:after="100" w:line="276" w:lineRule="auto"/>
-      </w:pPr>
-      <w:r>
-        <w:rPr>
-          <w:rFonts w:ascii="Aptos" w:hAnsi="Aptos" w:eastAsia="Aptos"/>
-          <w:b w:val="0"/>
-          <w:i w:val="0"/>
-          <w:color w:val="1F2D3D"/>
-          <w:sz w:val="22"/>
-        </w:rPr>
-        <w:t>Неделя закрывается после окончания воскресенья, в понедельник в 00:00.</w:t>
-      </w:r>
-    </w:p>
-    <w:p>
-      <w:pPr>
-        <w:pStyle w:val="Heading1"/>
-      </w:pPr>
-      <w:r>
-        <w:t>8. Перенос в следующий период</w:t>
-      </w:r>
-    </w:p>
-    <w:p>
-      <w:pPr>
-        <w:spacing w:after="100" w:line="276" w:lineRule="auto"/>
-      </w:pPr>
-      <w:r>
-        <w:rPr>
-          <w:rFonts w:ascii="Aptos" w:hAnsi="Aptos" w:eastAsia="Aptos"/>
-          <w:b w:val="0"/>
-          <w:i w:val="0"/>
-          <w:color w:val="1F2D3D"/>
-          <w:sz w:val="22"/>
-        </w:rPr>
-        <w:t>В новый период переносится положительный свободный остаток прошлого периода.</w:t>
-      </w:r>
-    </w:p>
-    <w:p>
-      <w:pPr>
-        <w:pStyle w:val="ListBullet"/>
-        <w:spacing w:after="60" w:line="269" w:lineRule="auto"/>
-        <w:ind w:left="403" w:hanging="230"/>
-      </w:pPr>
-      <w:r>
-        <w:rPr>
-          <w:rFonts w:ascii="Aptos" w:hAnsi="Aptos" w:eastAsia="Aptos"/>
-          <w:b w:val="0"/>
-          <w:i w:val="0"/>
-          <w:color w:val="1F2D3D"/>
-          <w:sz w:val="22"/>
-        </w:rPr>
-        <w:t>если осталось 120 BYN, в следующий период перейдет 120 BYN;</w:t>
-      </w:r>
-    </w:p>
-    <w:p>
-      <w:pPr>
-        <w:pStyle w:val="ListBullet"/>
-        <w:spacing w:after="60" w:line="269" w:lineRule="auto"/>
-        <w:ind w:left="403" w:hanging="230"/>
-      </w:pPr>
-      <w:r>
-        <w:rPr>
-          <w:rFonts w:ascii="Aptos" w:hAnsi="Aptos" w:eastAsia="Aptos"/>
-          <w:b w:val="0"/>
-          <w:i w:val="0"/>
-          <w:color w:val="1F2D3D"/>
-          <w:sz w:val="22"/>
-        </w:rPr>
-        <w:t>если получилось -50 BYN, отрицательная сумма не переносится, перенос будет 0 BYN.</w:t>
-      </w:r>
-    </w:p>
-    <w:p>
-      <w:pPr>
-        <w:spacing w:after="100" w:line="276" w:lineRule="auto"/>
-      </w:pPr>
-      <w:r>
-        <w:rPr>
-          <w:rFonts w:ascii="Aptos" w:hAnsi="Aptos" w:eastAsia="Aptos"/>
-          <w:b w:val="0"/>
-          <w:i w:val="0"/>
-          <w:color w:val="1F2D3D"/>
-          <w:sz w:val="22"/>
-        </w:rPr>
-        <w:t>Если в прошлом периоде был вручную указан остаток на счете, перенос учитывает это главное ручное число и изменения после него.</w:t>
-      </w:r>
-    </w:p>
-    <w:p>
-      <w:pPr>
-        <w:pStyle w:val="Heading1"/>
-      </w:pPr>
-      <w:r>
-        <w:t>9. Накопления</w:t>
-      </w:r>
-    </w:p>
-    <w:p>
-      <w:pPr>
-        <w:spacing w:after="100" w:line="276" w:lineRule="auto"/>
-      </w:pPr>
-      <w:r>
-        <w:rPr>
-          <w:rFonts w:ascii="Aptos" w:hAnsi="Aptos" w:eastAsia="Aptos"/>
-          <w:b w:val="0"/>
-          <w:i w:val="0"/>
-          <w:color w:val="1F2D3D"/>
-          <w:sz w:val="22"/>
-        </w:rPr>
-        <w:t>Накопления в USD и BYN считаются отдельно.</w:t>
-      </w:r>
-    </w:p>
-    <w:p>
-      <w:pPr>
-        <w:spacing w:after="100" w:line="276" w:lineRule="auto"/>
-      </w:pPr>
-      <w:r>
-        <w:rPr>
-          <w:rFonts w:ascii="Aptos" w:hAnsi="Aptos" w:eastAsia="Aptos"/>
-          <w:b w:val="0"/>
-          <w:i w:val="0"/>
-          <w:color w:val="1F2D3D"/>
-          <w:sz w:val="22"/>
-        </w:rPr>
-        <w:t>Для каждой валюты действует простое правило:</w:t>
-      </w:r>
-    </w:p>
-    <w:p>
-      <w:pPr>
-        <w:spacing w:after="140" w:line="276" w:lineRule="auto" w:before="60"/>
-        <w:ind w:left="230" w:right="230"/>
-        <w:shd w:fill="EEF5F1"/>
-      </w:pPr>
-      <w:r>
-        <w:rPr>
-          <w:rFonts w:ascii="Aptos" w:hAnsi="Aptos" w:eastAsia="Aptos"/>
-          <w:b/>
-          <w:i w:val="0"/>
-          <w:color w:val="405B5E"/>
-          <w:sz w:val="23"/>
-        </w:rPr>
-        <w:t>Все пополнения - все снятия</w:t>
-      </w:r>
-    </w:p>
-    <w:p>
-      <w:pPr>
-        <w:spacing w:after="100" w:line="276" w:lineRule="auto"/>
-      </w:pPr>
-      <w:r>
-        <w:rPr>
-          <w:rFonts w:ascii="Aptos" w:hAnsi="Aptos" w:eastAsia="Aptos"/>
-          <w:b w:val="0"/>
-          <w:i w:val="0"/>
-          <w:color w:val="1F2D3D"/>
-          <w:sz w:val="22"/>
-        </w:rPr>
-        <w:t>Пример для USD:</w:t>
-      </w:r>
-    </w:p>
-    <w:p>
-      <w:pPr>
-        <w:pStyle w:val="ListBullet"/>
-        <w:spacing w:after="60" w:line="269" w:lineRule="auto"/>
-        <w:ind w:left="403" w:hanging="230"/>
-      </w:pPr>
-      <w:r>
-        <w:rPr>
-          <w:rFonts w:ascii="Aptos" w:hAnsi="Aptos" w:eastAsia="Aptos"/>
-          <w:b w:val="0"/>
-          <w:i w:val="0"/>
-          <w:color w:val="1F2D3D"/>
-          <w:sz w:val="22"/>
-        </w:rPr>
-        <w:t>положили 300 USD;</w:t>
-      </w:r>
-    </w:p>
-    <w:p>
-      <w:pPr>
-        <w:pStyle w:val="ListBullet"/>
-        <w:spacing w:after="60" w:line="269" w:lineRule="auto"/>
-        <w:ind w:left="403" w:hanging="230"/>
-      </w:pPr>
-      <w:r>
-        <w:rPr>
-          <w:rFonts w:ascii="Aptos" w:hAnsi="Aptos" w:eastAsia="Aptos"/>
-          <w:b w:val="0"/>
-          <w:i w:val="0"/>
-          <w:color w:val="1F2D3D"/>
-          <w:sz w:val="22"/>
-        </w:rPr>
-        <w:t>потом взяли 50 USD;</w:t>
-      </w:r>
-    </w:p>
-    <w:p>
-      <w:pPr>
-        <w:pStyle w:val="ListBullet"/>
-        <w:spacing w:after="60" w:line="269" w:lineRule="auto"/>
-        <w:ind w:left="403" w:hanging="230"/>
-      </w:pPr>
-      <w:r>
-        <w:rPr>
-          <w:rFonts w:ascii="Aptos" w:hAnsi="Aptos" w:eastAsia="Aptos"/>
-          <w:b w:val="0"/>
-          <w:i w:val="0"/>
-          <w:color w:val="1F2D3D"/>
-          <w:sz w:val="22"/>
-        </w:rPr>
-        <w:t>осталось 250 USD.</w:t>
-      </w:r>
-    </w:p>
-    <w:p>
-      <w:pPr>
-        <w:spacing w:after="100" w:line="276" w:lineRule="auto"/>
-      </w:pPr>
-      <w:r>
-        <w:rPr>
-          <w:rFonts w:ascii="Aptos" w:hAnsi="Aptos" w:eastAsia="Aptos"/>
-          <w:b w:val="0"/>
-          <w:i w:val="0"/>
-          <w:color w:val="1F2D3D"/>
-          <w:sz w:val="22"/>
-        </w:rPr>
-        <w:t>Если BYN равны нулю, приложение показывает только USD. Если BYN есть, показываются обе суммы: например, 250 USD + 100 BYN.</w:t>
-      </w:r>
-    </w:p>
-    <w:p>
-      <w:pPr>
-        <w:spacing w:after="100" w:line="276" w:lineRule="auto"/>
-      </w:pPr>
-      <w:r>
-        <w:rPr>
-          <w:rFonts w:ascii="Aptos" w:hAnsi="Aptos" w:eastAsia="Aptos"/>
-          <w:b w:val="0"/>
-          <w:i w:val="0"/>
-          <w:color w:val="1F2D3D"/>
-          <w:sz w:val="22"/>
-        </w:rPr>
-        <w:t>Обмен BYN на USD уменьшает BYN и добавляет купленные USD.</w:t>
-      </w:r>
-    </w:p>
-    <w:p>
-      <w:pPr>
-        <w:spacing w:after="100" w:line="276" w:lineRule="auto"/>
-      </w:pPr>
-      <w:r>
-        <w:rPr>
-          <w:rFonts w:ascii="Aptos" w:hAnsi="Aptos" w:eastAsia="Aptos"/>
-          <w:b w:val="0"/>
-          <w:i w:val="0"/>
-          <w:color w:val="1F2D3D"/>
-          <w:sz w:val="22"/>
-        </w:rPr>
-        <w:t>Важно: в расчет обычного счета как фактическое списание сейчас входят пополнения накоплений в BYN. Пополнения в USD ведутся отдельной валютной историей и не отнимаются как BYN-трата.</w:t>
-      </w:r>
-    </w:p>
-    <w:p>
-      <w:pPr>
-        <w:pStyle w:val="Heading1"/>
-      </w:pPr>
-      <w:r>
-        <w:t>10. Подушка безопасности</w:t>
-      </w:r>
-    </w:p>
-    <w:p>
-      <w:pPr>
-        <w:spacing w:after="100" w:line="276" w:lineRule="auto"/>
-      </w:pPr>
-      <w:r>
-        <w:rPr>
-          <w:rFonts w:ascii="Aptos" w:hAnsi="Aptos" w:eastAsia="Aptos"/>
-          <w:b w:val="0"/>
-          <w:i w:val="0"/>
-          <w:color w:val="1F2D3D"/>
-          <w:sz w:val="22"/>
-        </w:rPr>
-        <w:t>Подушка безопасности живет отдельно.</w:t>
-      </w:r>
-    </w:p>
-    <w:p>
-      <w:pPr>
-        <w:pStyle w:val="ListBullet"/>
-        <w:spacing w:after="60" w:line="269" w:lineRule="auto"/>
-        <w:ind w:left="403" w:hanging="230"/>
-      </w:pPr>
-      <w:r>
-        <w:rPr>
-          <w:rFonts w:ascii="Aptos" w:hAnsi="Aptos" w:eastAsia="Aptos"/>
-          <w:b w:val="0"/>
-          <w:i w:val="0"/>
-          <w:color w:val="1F2D3D"/>
-          <w:sz w:val="22"/>
-        </w:rPr>
-        <w:t>ее сумма не прибавляется к обычному счету;</w:t>
-      </w:r>
-    </w:p>
-    <w:p>
-      <w:pPr>
-        <w:pStyle w:val="ListBullet"/>
-        <w:spacing w:after="60" w:line="269" w:lineRule="auto"/>
-        <w:ind w:left="403" w:hanging="230"/>
-      </w:pPr>
-      <w:r>
-        <w:rPr>
-          <w:rFonts w:ascii="Aptos" w:hAnsi="Aptos" w:eastAsia="Aptos"/>
-          <w:b w:val="0"/>
-          <w:i w:val="0"/>
-          <w:color w:val="1F2D3D"/>
-          <w:sz w:val="22"/>
-        </w:rPr>
-        <w:t>она не входит в свободный остаток;</w:t>
-      </w:r>
-    </w:p>
-    <w:p>
-      <w:pPr>
-        <w:pStyle w:val="ListBullet"/>
-        <w:spacing w:after="60" w:line="269" w:lineRule="auto"/>
-        <w:ind w:left="403" w:hanging="230"/>
-      </w:pPr>
-      <w:r>
-        <w:rPr>
-          <w:rFonts w:ascii="Aptos" w:hAnsi="Aptos" w:eastAsia="Aptos"/>
-          <w:b w:val="0"/>
-          <w:i w:val="0"/>
-          <w:color w:val="1F2D3D"/>
-          <w:sz w:val="22"/>
-        </w:rPr>
-        <w:t>она не помогает оплачивать покупки;</w:t>
-      </w:r>
-    </w:p>
-    <w:p>
-      <w:pPr>
-        <w:pStyle w:val="ListBullet"/>
-        <w:spacing w:after="60" w:line="269" w:lineRule="auto"/>
-        <w:ind w:left="403" w:hanging="230"/>
-      </w:pPr>
-      <w:r>
-        <w:rPr>
-          <w:rFonts w:ascii="Aptos" w:hAnsi="Aptos" w:eastAsia="Aptos"/>
-          <w:b w:val="0"/>
-          <w:i w:val="0"/>
-          <w:color w:val="1F2D3D"/>
-          <w:sz w:val="22"/>
-        </w:rPr>
-        <w:t>она просто показывает, сколько собрано из цели 2 000 USD.</w:t>
-      </w:r>
-    </w:p>
-    <w:p>
-      <w:pPr>
-        <w:spacing w:after="100" w:line="276" w:lineRule="auto"/>
-      </w:pPr>
-      <w:r>
-        <w:rPr>
-          <w:rFonts w:ascii="Aptos" w:hAnsi="Aptos" w:eastAsia="Aptos"/>
-          <w:b w:val="0"/>
-          <w:i w:val="0"/>
-          <w:color w:val="1F2D3D"/>
-          <w:sz w:val="22"/>
-        </w:rPr>
-        <w:t>После достижения цели вместо дроби показывается только собранная сумма.</w:t>
+        <w:t>Обмен уже отложенных BYN на USD не меняет обычный счёт: деньги просто переходят из одной валюты накоплений в другую.</w:t>
       </w:r>
     </w:p>
     <w:p>
@@ -2030,39 +1142,7 @@
           <w:color w:val="1F2D3D"/>
           <w:sz w:val="22"/>
         </w:rPr>
-        <w:t>Для покупки приложение проверяет:</w:t>
-      </w:r>
-    </w:p>
-    <w:p>
-      <w:pPr>
-        <w:spacing w:after="140" w:line="276" w:lineRule="auto" w:before="60"/>
-        <w:ind w:left="230" w:right="230"/>
-        <w:shd w:fill="EEF5F1"/>
-      </w:pPr>
-      <w:r>
-        <w:rPr>
-          <w:rFonts w:ascii="Aptos" w:hAnsi="Aptos" w:eastAsia="Aptos"/>
-          <w:b/>
-          <w:i w:val="0"/>
-          <w:color w:val="405B5E"/>
-          <w:sz w:val="23"/>
-        </w:rPr>
-        <w:t>Накоплений в USD достаточно для цены или нет</w:t>
-      </w:r>
-    </w:p>
-    <w:p>
-      <w:pPr>
-        <w:spacing w:after="100" w:line="276" w:lineRule="auto"/>
-      </w:pPr>
-      <w:r>
-        <w:rPr>
-          <w:rFonts w:ascii="Aptos" w:hAnsi="Aptos" w:eastAsia="Aptos"/>
-          <w:b w:val="0"/>
-          <w:i w:val="0"/>
-          <w:color w:val="1F2D3D"/>
-          <w:sz w:val="22"/>
-        </w:rPr>
-        <w:t>Пример:</w:t>
+        <w:t>При отметке покупки как совершённой нужно выбрать источник денег:</w:t>
       </w:r>
     </w:p>
     <w:p>
@@ -2079,7 +1159,7 @@
           <w:color w:val="1F2D3D"/>
           <w:sz w:val="22"/>
         </w:rPr>
-        <w:t>накопления: 300 USD;</w:t>
+        <w:t>накопления USD;</w:t>
       </w:r>
     </w:p>
     <w:p>
@@ -2096,7 +1176,7 @@
           <w:color w:val="1F2D3D"/>
           <w:sz w:val="22"/>
         </w:rPr>
-        <w:t>покупка стоит 250 USD;</w:t>
+        <w:t>подушка безопасности USD;</w:t>
       </w:r>
     </w:p>
     <w:p>
@@ -2113,7 +1193,7 @@
           <w:color w:val="1F2D3D"/>
           <w:sz w:val="22"/>
         </w:rPr>
-        <w:t>покупка считается доступной.</w:t>
+        <w:t>обычный счёт BYN.</w:t>
       </w:r>
     </w:p>
     <w:p>
@@ -2128,7 +1208,7 @@
           <w:color w:val="1F2D3D"/>
           <w:sz w:val="22"/>
         </w:rPr>
-        <w:t>Важно: простая отметка «куплено» сейчас закрывает карточку, но сама не снимает деньги из накоплений. Чтобы сумма накоплений уменьшилась, нужно отдельно оформить снятие.</w:t>
+        <w:t>Приложение вычитает сумму только из выбранного источника. Для обычного счёта также выбирается категория расхода.</w:t>
       </w:r>
     </w:p>
     <w:p>
@@ -2136,7 +1216,7 @@
         <w:pStyle w:val="Heading1"/>
       </w:pPr>
       <w:r>
-        <w:t>12. Питомец</w:t>
+        <w:t>12. Питомец и подарки</w:t>
       </w:r>
     </w:p>
     <w:p>
@@ -2151,7 +1231,60 @@
           <w:color w:val="1F2D3D"/>
           <w:sz w:val="22"/>
         </w:rPr>
-        <w:t>У питомца свой отдельный баланс.</w:t>
+        <w:t>Пополнение питомца или подарков переводит деньги с обычного счёта во внутренний конверт.</w:t>
+      </w:r>
+    </w:p>
+    <w:p>
+      <w:pPr>
+        <w:spacing w:after="100" w:line="276" w:lineRule="auto"/>
+      </w:pPr>
+      <w:r>
+        <w:rPr>
+          <w:rFonts w:ascii="Aptos" w:hAnsi="Aptos" w:eastAsia="Aptos"/>
+          <w:b w:val="0"/>
+          <w:i w:val="0"/>
+          <w:color w:val="1F2D3D"/>
+          <w:sz w:val="22"/>
+        </w:rPr>
+        <w:t>Покупка для питомца или готовый подарок уменьшают только соответствующий внутренний баланс.</w:t>
+      </w:r>
+    </w:p>
+    <w:p>
+      <w:pPr>
+        <w:spacing w:after="100" w:line="276" w:lineRule="auto"/>
+      </w:pPr>
+      <w:r>
+        <w:rPr>
+          <w:rFonts w:ascii="Aptos" w:hAnsi="Aptos" w:eastAsia="Aptos"/>
+          <w:b w:val="0"/>
+          <w:i w:val="0"/>
+          <w:color w:val="1F2D3D"/>
+          <w:sz w:val="22"/>
+        </w:rPr>
+        <w:t>Так одна и та же сумма не вычитается дважды.</w:t>
+      </w:r>
+    </w:p>
+    <w:p>
+      <w:pPr>
+        <w:pStyle w:val="Heading1"/>
+      </w:pPr>
+      <w:r>
+        <w:t>13. Удаление операций</w:t>
+      </w:r>
+    </w:p>
+    <w:p>
+      <w:pPr>
+        <w:spacing w:after="100" w:line="276" w:lineRule="auto"/>
+      </w:pPr>
+      <w:r>
+        <w:rPr>
+          <w:rFonts w:ascii="Aptos" w:hAnsi="Aptos" w:eastAsia="Aptos"/>
+          <w:b w:val="0"/>
+          <w:i w:val="0"/>
+          <w:color w:val="1F2D3D"/>
+          <w:sz w:val="22"/>
+        </w:rPr>
+        <w:t>Операции можно удалять. Удаление отменяет их влияние:</w:t>
       </w:r>
     </w:p>
     <w:p>
@@ -2168,7 +1301,7 @@
           <w:color w:val="1F2D3D"/>
           <w:sz w:val="22"/>
         </w:rPr>
-        <w:t>пополнение увеличивает баланс;</w:t>
+        <w:t>удалили расход — деньги вернулись на счёт, а трата убралась из категории;</w:t>
       </w:r>
     </w:p>
     <w:p>
@@ -2185,7 +1318,7 @@
           <w:color w:val="1F2D3D"/>
           <w:sz w:val="22"/>
         </w:rPr>
-        <w:t>ручное списание уменьшает баланс;</w:t>
+        <w:t>удалили перевод в конверт — деньги вернулись на счёт и ушли из конверта;</w:t>
       </w:r>
     </w:p>
     <w:p>
@@ -2202,22 +1335,7 @@
           <w:color w:val="1F2D3D"/>
           <w:sz w:val="22"/>
         </w:rPr>
-        <w:t>выполненная запланированная покупка для питомца автоматически уменьшает баланс на ее цену.</w:t>
-      </w:r>
-    </w:p>
-    <w:p>
-      <w:pPr>
-        <w:spacing w:after="100" w:line="276" w:lineRule="auto"/>
-      </w:pPr>
-      <w:r>
-        <w:rPr>
-          <w:rFonts w:ascii="Aptos" w:hAnsi="Aptos" w:eastAsia="Aptos"/>
-          <w:b w:val="0"/>
-          <w:i w:val="0"/>
-          <w:color w:val="1F2D3D"/>
-          <w:sz w:val="22"/>
-        </w:rPr>
-        <w:t>Пример:</w:t>
+        <w:t>удалили доход — сумма дохода вычлась со счёта;</w:t>
       </w:r>
     </w:p>
     <w:p>
@@ -2234,7 +1352,45 @@
           <w:color w:val="1F2D3D"/>
           <w:sz w:val="22"/>
         </w:rPr>
-        <w:t>у питомца 200 BYN;</w:t>
+        <w:t>удалили покупку — она снова стала незавершённой, а деньги вернулись в её источник.</w:t>
+      </w:r>
+    </w:p>
+    <w:p>
+      <w:pPr>
+        <w:spacing w:after="100" w:line="276" w:lineRule="auto"/>
+      </w:pPr>
+      <w:r>
+        <w:rPr>
+          <w:rFonts w:ascii="Aptos" w:hAnsi="Aptos" w:eastAsia="Aptos"/>
+          <w:b w:val="0"/>
+          <w:i w:val="0"/>
+          <w:color w:val="1F2D3D"/>
+          <w:sz w:val="22"/>
+        </w:rPr>
+        <w:t>Перед удалением приложение просит подтверждение.</w:t>
+      </w:r>
+    </w:p>
+    <w:p>
+      <w:pPr>
+        <w:pStyle w:val="Heading1"/>
+      </w:pPr>
+      <w:r>
+        <w:t>14. Что сохраняется</w:t>
+      </w:r>
+    </w:p>
+    <w:p>
+      <w:pPr>
+        <w:spacing w:after="100" w:line="276" w:lineRule="auto"/>
+      </w:pPr>
+      <w:r>
+        <w:rPr>
+          <w:rFonts w:ascii="Aptos" w:hAnsi="Aptos" w:eastAsia="Aptos"/>
+          <w:b w:val="0"/>
+          <w:i w:val="0"/>
+          <w:color w:val="1F2D3D"/>
+          <w:sz w:val="22"/>
+        </w:rPr>
+        <w:t>В резервную копию входят:</w:t>
       </w:r>
     </w:p>
     <w:p>
@@ -2251,7 +1407,7 @@
           <w:color w:val="1F2D3D"/>
           <w:sz w:val="22"/>
         </w:rPr>
-        <w:t>корм стоит 60 BYN;</w:t>
+        <w:t>общий счёт и вся история операций;</w:t>
       </w:r>
     </w:p>
     <w:p>
@@ -2268,162 +1424,7 @@
           <w:color w:val="1F2D3D"/>
           <w:sz w:val="22"/>
         </w:rPr>
-        <w:t>после отметки «совершено» останется 140 BYN.</w:t>
-      </w:r>
-    </w:p>
-    <w:p>
-      <w:pPr>
-        <w:spacing w:after="100" w:line="276" w:lineRule="auto"/>
-      </w:pPr>
-      <w:r>
-        <w:rPr>
-          <w:rFonts w:ascii="Aptos" w:hAnsi="Aptos" w:eastAsia="Aptos"/>
-          <w:b w:val="0"/>
-          <w:i w:val="0"/>
-          <w:color w:val="1F2D3D"/>
-          <w:sz w:val="22"/>
-        </w:rPr>
-        <w:t>Баланс питомца хранится отдельно от истории. Поэтому удаление строки из истории не возвращает деньги и не меняет текущий баланс.</w:t>
-      </w:r>
-    </w:p>
-    <w:p>
-      <w:pPr>
-        <w:pStyle w:val="Heading1"/>
-      </w:pPr>
-      <w:r>
-        <w:t>13. Подарки</w:t>
-      </w:r>
-    </w:p>
-    <w:p>
-      <w:pPr>
-        <w:spacing w:after="100" w:line="276" w:lineRule="auto"/>
-      </w:pPr>
-      <w:r>
-        <w:rPr>
-          <w:rFonts w:ascii="Aptos" w:hAnsi="Aptos" w:eastAsia="Aptos"/>
-          <w:b w:val="0"/>
-          <w:i w:val="0"/>
-          <w:color w:val="1F2D3D"/>
-          <w:sz w:val="22"/>
-        </w:rPr>
-        <w:t>У подарков тоже отдельный баланс:</w:t>
-      </w:r>
-    </w:p>
-    <w:p>
-      <w:pPr>
-        <w:spacing w:after="140" w:line="276" w:lineRule="auto" w:before="60"/>
-        <w:ind w:left="230" w:right="230"/>
-        <w:shd w:fill="EEF5F1"/>
-      </w:pPr>
-      <w:r>
-        <w:rPr>
-          <w:rFonts w:ascii="Aptos" w:hAnsi="Aptos" w:eastAsia="Aptos"/>
-          <w:b/>
-          <w:i w:val="0"/>
-          <w:color w:val="405B5E"/>
-          <w:sz w:val="23"/>
-        </w:rPr>
-        <w:t>Начальная сумма + пополнения - траты</w:t>
-      </w:r>
-    </w:p>
-    <w:p>
-      <w:pPr>
-        <w:spacing w:after="100" w:line="276" w:lineRule="auto"/>
-      </w:pPr>
-      <w:r>
-        <w:rPr>
-          <w:rFonts w:ascii="Aptos" w:hAnsi="Aptos" w:eastAsia="Aptos"/>
-          <w:b w:val="0"/>
-          <w:i w:val="0"/>
-          <w:color w:val="1F2D3D"/>
-          <w:sz w:val="22"/>
-        </w:rPr>
-        <w:t>Если запланированный подарок отмечен купленным, его цена автоматически добавляется как трата и уменьшает баланс подарков.</w:t>
-      </w:r>
-    </w:p>
-    <w:p>
-      <w:pPr>
-        <w:spacing w:after="100" w:line="276" w:lineRule="auto"/>
-      </w:pPr>
-      <w:r>
-        <w:rPr>
-          <w:rFonts w:ascii="Aptos" w:hAnsi="Aptos" w:eastAsia="Aptos"/>
-          <w:b w:val="0"/>
-          <w:i w:val="0"/>
-          <w:color w:val="1F2D3D"/>
-          <w:sz w:val="22"/>
-        </w:rPr>
-        <w:t>В отличие от питомца, баланс подарков сейчас считается по списку операций. Поэтому удаление операции из истории подарков меняет их баланс.</w:t>
-      </w:r>
-    </w:p>
-    <w:p>
-      <w:pPr>
-        <w:pStyle w:val="Heading1"/>
-      </w:pPr>
-      <w:r>
-        <w:t>14. Платежи и долг</w:t>
-      </w:r>
-    </w:p>
-    <w:p>
-      <w:pPr>
-        <w:spacing w:after="100" w:line="276" w:lineRule="auto"/>
-      </w:pPr>
-      <w:r>
-        <w:rPr>
-          <w:rFonts w:ascii="Aptos" w:hAnsi="Aptos" w:eastAsia="Aptos"/>
-          <w:b w:val="0"/>
-          <w:i w:val="0"/>
-          <w:color w:val="1F2D3D"/>
-          <w:sz w:val="22"/>
-        </w:rPr>
-        <w:t>Остаток долга считается так:</w:t>
-      </w:r>
-    </w:p>
-    <w:p>
-      <w:pPr>
-        <w:spacing w:after="140" w:line="276" w:lineRule="auto" w:before="60"/>
-        <w:ind w:left="230" w:right="230"/>
-        <w:shd w:fill="EEF5F1"/>
-      </w:pPr>
-      <w:r>
-        <w:rPr>
-          <w:rFonts w:ascii="Aptos" w:hAnsi="Aptos" w:eastAsia="Aptos"/>
-          <w:b/>
-          <w:i w:val="0"/>
-          <w:color w:val="405B5E"/>
-          <w:sz w:val="23"/>
-        </w:rPr>
-        <w:t>Начальный долг - все уже оплаченные суммы</w:t>
-      </w:r>
-    </w:p>
-    <w:p>
-      <w:pPr>
-        <w:spacing w:after="100" w:line="276" w:lineRule="auto"/>
-      </w:pPr>
-      <w:r>
-        <w:rPr>
-          <w:rFonts w:ascii="Aptos" w:hAnsi="Aptos" w:eastAsia="Aptos"/>
-          <w:b w:val="0"/>
-          <w:i w:val="0"/>
-          <w:color w:val="1F2D3D"/>
-          <w:sz w:val="22"/>
-        </w:rPr>
-        <w:t>Результат не может быть меньше нуля.</w:t>
-      </w:r>
-    </w:p>
-    <w:p>
-      <w:pPr>
-        <w:spacing w:after="100" w:line="276" w:lineRule="auto"/>
-      </w:pPr>
-      <w:r>
-        <w:rPr>
-          <w:rFonts w:ascii="Aptos" w:hAnsi="Aptos" w:eastAsia="Aptos"/>
-          <w:b w:val="0"/>
-          <w:i w:val="0"/>
-          <w:color w:val="1F2D3D"/>
-          <w:sz w:val="22"/>
-        </w:rPr>
-        <w:t>Пример:</w:t>
+        <w:t>месяцы, планы и недели;</w:t>
       </w:r>
     </w:p>
     <w:p>
@@ -2440,7 +1441,7 @@
           <w:color w:val="1F2D3D"/>
           <w:sz w:val="22"/>
         </w:rPr>
-        <w:t>начальный долг: 1 000 BYN;</w:t>
+        <w:t>категории, названия и иконки;</w:t>
       </w:r>
     </w:p>
     <w:p>
@@ -2457,7 +1458,7 @@
           <w:color w:val="1F2D3D"/>
           <w:sz w:val="22"/>
         </w:rPr>
-        <w:t>оплачено: 650 BYN;</w:t>
+        <w:t>накопления, подушка, питомец и подарки;</w:t>
       </w:r>
     </w:p>
     <w:p>
@@ -2474,83 +1475,7 @@
           <w:color w:val="1F2D3D"/>
           <w:sz w:val="22"/>
         </w:rPr>
-        <w:t>осталось: 350 BYN.</w:t>
-      </w:r>
-    </w:p>
-    <w:p>
-      <w:pPr>
-        <w:pStyle w:val="Heading1"/>
-      </w:pPr>
-      <w:r>
-        <w:t>15. Строка «Потрачено сейчас» на главной</w:t>
-      </w:r>
-    </w:p>
-    <w:p>
-      <w:pPr>
-        <w:spacing w:after="100" w:line="276" w:lineRule="auto"/>
-      </w:pPr>
-      <w:r>
-        <w:rPr>
-          <w:rFonts w:ascii="Aptos" w:hAnsi="Aptos" w:eastAsia="Aptos"/>
-          <w:b w:val="0"/>
-          <w:i w:val="0"/>
-          <w:color w:val="1F2D3D"/>
-          <w:sz w:val="22"/>
-        </w:rPr>
-        <w:t>Строка складывает уже совершенные траты текущего периода и показывает их по категориям.</w:t>
-      </w:r>
-    </w:p>
-    <w:p>
-      <w:pPr>
-        <w:spacing w:after="100" w:line="276" w:lineRule="auto"/>
-      </w:pPr>
-      <w:r>
-        <w:rPr>
-          <w:rFonts w:ascii="Aptos" w:hAnsi="Aptos" w:eastAsia="Aptos"/>
-          <w:b w:val="0"/>
-          <w:i w:val="0"/>
-          <w:color w:val="1F2D3D"/>
-          <w:sz w:val="22"/>
-        </w:rPr>
-        <w:t>Она учитывает квартиру, платежи, резерв, пополнение накоплений в BYN и расходы категорий, включая еду.</w:t>
-      </w:r>
-    </w:p>
-    <w:p>
-      <w:pPr>
-        <w:spacing w:after="100" w:line="276" w:lineRule="auto"/>
-      </w:pPr>
-      <w:r>
-        <w:rPr>
-          <w:rFonts w:ascii="Aptos" w:hAnsi="Aptos" w:eastAsia="Aptos"/>
-          <w:b w:val="0"/>
-          <w:i w:val="0"/>
-          <w:color w:val="1F2D3D"/>
-          <w:sz w:val="22"/>
-        </w:rPr>
-        <w:t>Это справочная строка. Сами числа для нее берутся из тех же данных, которые используются при расчете остатка на счете.</w:t>
-      </w:r>
-    </w:p>
-    <w:p>
-      <w:pPr>
-        <w:pStyle w:val="Heading1"/>
-      </w:pPr>
-      <w:r>
-        <w:t>16. Что не участвует в главных расчетах</w:t>
-      </w:r>
-    </w:p>
-    <w:p>
-      <w:pPr>
-        <w:spacing w:after="100" w:line="276" w:lineRule="auto"/>
-      </w:pPr>
-      <w:r>
-        <w:rPr>
-          <w:rFonts w:ascii="Aptos" w:hAnsi="Aptos" w:eastAsia="Aptos"/>
-          <w:b w:val="0"/>
-          <w:i w:val="0"/>
-          <w:color w:val="1F2D3D"/>
-          <w:sz w:val="22"/>
-        </w:rPr>
-        <w:t>Отдельно от обычного счета и свободного остатка живут:</w:t>
+        <w:t>покупки и платежи;</w:t>
       </w:r>
     </w:p>
     <w:p>
@@ -2567,83 +1492,7 @@
           <w:color w:val="1F2D3D"/>
           <w:sz w:val="22"/>
         </w:rPr>
-        <w:t>подушка безопасности;</w:t>
-      </w:r>
-    </w:p>
-    <w:p>
-      <w:pPr>
-        <w:pStyle w:val="ListBullet"/>
-        <w:spacing w:after="60" w:line="269" w:lineRule="auto"/>
-        <w:ind w:left="403" w:hanging="230"/>
-      </w:pPr>
-      <w:r>
-        <w:rPr>
-          <w:rFonts w:ascii="Aptos" w:hAnsi="Aptos" w:eastAsia="Aptos"/>
-          <w:b w:val="0"/>
-          <w:i w:val="0"/>
-          <w:color w:val="1F2D3D"/>
-          <w:sz w:val="22"/>
-        </w:rPr>
-        <w:t>баланс питомца;</w:t>
-      </w:r>
-    </w:p>
-    <w:p>
-      <w:pPr>
-        <w:pStyle w:val="ListBullet"/>
-        <w:spacing w:after="60" w:line="269" w:lineRule="auto"/>
-        <w:ind w:left="403" w:hanging="230"/>
-      </w:pPr>
-      <w:r>
-        <w:rPr>
-          <w:rFonts w:ascii="Aptos" w:hAnsi="Aptos" w:eastAsia="Aptos"/>
-          <w:b w:val="0"/>
-          <w:i w:val="0"/>
-          <w:color w:val="1F2D3D"/>
-          <w:sz w:val="22"/>
-        </w:rPr>
-        <w:t>баланс подарков;</w:t>
-      </w:r>
-    </w:p>
-    <w:p>
-      <w:pPr>
-        <w:pStyle w:val="ListBullet"/>
-        <w:spacing w:after="60" w:line="269" w:lineRule="auto"/>
-        <w:ind w:left="403" w:hanging="230"/>
-      </w:pPr>
-      <w:r>
-        <w:rPr>
-          <w:rFonts w:ascii="Aptos" w:hAnsi="Aptos" w:eastAsia="Aptos"/>
-          <w:b w:val="0"/>
-          <w:i w:val="0"/>
-          <w:color w:val="1F2D3D"/>
-          <w:sz w:val="22"/>
-        </w:rPr>
-        <w:t>USD-накопления как отдельная валютная сумма;</w:t>
-      </w:r>
-    </w:p>
-    <w:p>
-      <w:pPr>
-        <w:pStyle w:val="ListBullet"/>
-        <w:spacing w:after="60" w:line="269" w:lineRule="auto"/>
-        <w:ind w:left="403" w:hanging="230"/>
-      </w:pPr>
-      <w:r>
-        <w:rPr>
-          <w:rFonts w:ascii="Aptos" w:hAnsi="Aptos" w:eastAsia="Aptos"/>
-          <w:b w:val="0"/>
-          <w:i w:val="0"/>
-          <w:color w:val="1F2D3D"/>
-          <w:sz w:val="22"/>
-        </w:rPr>
-        <w:t>картинки, цвета, иконки и другие настройки внешнего вида.</w:t>
-      </w:r>
-    </w:p>
-    <w:p>
-      <w:pPr>
-        <w:pStyle w:val="Heading1"/>
-      </w:pPr>
-      <w:r>
-        <w:t>17. Большой пример целиком</w:t>
+        <w:t>настройки внешнего вида, фон и загруженные картинки.</w:t>
       </w:r>
     </w:p>
     <w:p>
@@ -2658,126 +1507,15 @@
           <w:color w:val="1F2D3D"/>
           <w:sz w:val="22"/>
         </w:rPr>
-        <w:t>Допустим:</w:t>
+        <w:t>После восстановления приложение проверяет формат копии и показывает, сколько данных найдено.</w:t>
       </w:r>
     </w:p>
     <w:p>
       <w:pPr>
-        <w:pStyle w:val="ListBullet"/>
-        <w:spacing w:after="60" w:line="269" w:lineRule="auto"/>
-        <w:ind w:left="403" w:hanging="230"/>
+        <w:pStyle w:val="Heading1"/>
       </w:pPr>
       <w:r>
-        <w:rPr>
-          <w:rFonts w:ascii="Aptos" w:hAnsi="Aptos" w:eastAsia="Aptos"/>
-          <w:b w:val="0"/>
-          <w:i w:val="0"/>
-          <w:color w:val="1F2D3D"/>
-          <w:sz w:val="22"/>
-        </w:rPr>
-        <w:t>зарплата: 2 000 BYN;</w:t>
-      </w:r>
-    </w:p>
-    <w:p>
-      <w:pPr>
-        <w:pStyle w:val="ListBullet"/>
-        <w:spacing w:after="60" w:line="269" w:lineRule="auto"/>
-        <w:ind w:left="403" w:hanging="230"/>
-      </w:pPr>
-      <w:r>
-        <w:rPr>
-          <w:rFonts w:ascii="Aptos" w:hAnsi="Aptos" w:eastAsia="Aptos"/>
-          <w:b w:val="0"/>
-          <w:i w:val="0"/>
-          <w:color w:val="1F2D3D"/>
-          <w:sz w:val="22"/>
-        </w:rPr>
-        <w:t>перенос: 100 BYN;</w:t>
-      </w:r>
-    </w:p>
-    <w:p>
-      <w:pPr>
-        <w:pStyle w:val="ListBullet"/>
-        <w:spacing w:after="60" w:line="269" w:lineRule="auto"/>
-        <w:ind w:left="403" w:hanging="230"/>
-      </w:pPr>
-      <w:r>
-        <w:rPr>
-          <w:rFonts w:ascii="Aptos" w:hAnsi="Aptos" w:eastAsia="Aptos"/>
-          <w:b w:val="0"/>
-          <w:i w:val="0"/>
-          <w:color w:val="1F2D3D"/>
-          <w:sz w:val="22"/>
-        </w:rPr>
-        <w:t>квартира: 600 BYN;</w:t>
-      </w:r>
-    </w:p>
-    <w:p>
-      <w:pPr>
-        <w:pStyle w:val="ListBullet"/>
-        <w:spacing w:after="60" w:line="269" w:lineRule="auto"/>
-        <w:ind w:left="403" w:hanging="230"/>
-      </w:pPr>
-      <w:r>
-        <w:rPr>
-          <w:rFonts w:ascii="Aptos" w:hAnsi="Aptos" w:eastAsia="Aptos"/>
-          <w:b w:val="0"/>
-          <w:i w:val="0"/>
-          <w:color w:val="1F2D3D"/>
-          <w:sz w:val="22"/>
-        </w:rPr>
-        <w:t>еда: 400 BYN;</w:t>
-      </w:r>
-    </w:p>
-    <w:p>
-      <w:pPr>
-        <w:pStyle w:val="ListBullet"/>
-        <w:spacing w:after="60" w:line="269" w:lineRule="auto"/>
-        <w:ind w:left="403" w:hanging="230"/>
-      </w:pPr>
-      <w:r>
-        <w:rPr>
-          <w:rFonts w:ascii="Aptos" w:hAnsi="Aptos" w:eastAsia="Aptos"/>
-          <w:b w:val="0"/>
-          <w:i w:val="0"/>
-          <w:color w:val="1F2D3D"/>
-          <w:sz w:val="22"/>
-        </w:rPr>
-        <w:t>платежи: 200 BYN;</w:t>
-      </w:r>
-    </w:p>
-    <w:p>
-      <w:pPr>
-        <w:pStyle w:val="ListBullet"/>
-        <w:spacing w:after="60" w:line="269" w:lineRule="auto"/>
-        <w:ind w:left="403" w:hanging="230"/>
-      </w:pPr>
-      <w:r>
-        <w:rPr>
-          <w:rFonts w:ascii="Aptos" w:hAnsi="Aptos" w:eastAsia="Aptos"/>
-          <w:b w:val="0"/>
-          <w:i w:val="0"/>
-          <w:color w:val="1F2D3D"/>
-          <w:sz w:val="22"/>
-        </w:rPr>
-        <w:t>резерв: 100 BYN;</w:t>
-      </w:r>
-    </w:p>
-    <w:p>
-      <w:pPr>
-        <w:pStyle w:val="ListBullet"/>
-        <w:spacing w:after="60" w:line="269" w:lineRule="auto"/>
-        <w:ind w:left="403" w:hanging="230"/>
-      </w:pPr>
-      <w:r>
-        <w:rPr>
-          <w:rFonts w:ascii="Aptos" w:hAnsi="Aptos" w:eastAsia="Aptos"/>
-          <w:b w:val="0"/>
-          <w:i w:val="0"/>
-          <w:color w:val="1F2D3D"/>
-          <w:sz w:val="22"/>
-        </w:rPr>
-        <w:t>другие категории: 300 BYN.</w:t>
+        <w:t>Коротко</w:t>
       </w:r>
     </w:p>
     <w:p>
@@ -2792,7 +1530,88 @@
           <w:color w:val="1F2D3D"/>
           <w:sz w:val="22"/>
         </w:rPr>
-        <w:t>Всего запланировано 1 600 BYN.</w:t>
+        <w:t>Запомнить нужно три вещи:</w:t>
+      </w:r>
+    </w:p>
+    <w:p>
+      <w:pPr>
+        <w:pStyle w:val="ListNumber"/>
+        <w:spacing w:after="60" w:line="269" w:lineRule="auto"/>
+        <w:ind w:left="461" w:hanging="259"/>
+      </w:pPr>
+      <w:r>
+        <w:rPr>
+          <w:rFonts w:ascii="Aptos" w:hAnsi="Aptos" w:eastAsia="Aptos"/>
+          <w:b/>
+          <w:i w:val="0"/>
+          <w:color w:val="1F2D3D"/>
+          <w:sz w:val="22"/>
+        </w:rPr>
+        <w:t>Счёт</w:t>
+      </w:r>
+      <w:r>
+        <w:rPr>
+          <w:rFonts w:ascii="Aptos" w:hAnsi="Aptos" w:eastAsia="Aptos"/>
+          <w:b w:val="0"/>
+          <w:i w:val="0"/>
+          <w:color w:val="1F2D3D"/>
+          <w:sz w:val="22"/>
+        </w:rPr>
+        <w:t xml:space="preserve"> — сколько денег действительно есть сейчас.</w:t>
+      </w:r>
+    </w:p>
+    <w:p>
+      <w:pPr>
+        <w:pStyle w:val="ListNumber"/>
+        <w:spacing w:after="60" w:line="269" w:lineRule="auto"/>
+        <w:ind w:left="461" w:hanging="259"/>
+      </w:pPr>
+      <w:r>
+        <w:rPr>
+          <w:rFonts w:ascii="Aptos" w:hAnsi="Aptos" w:eastAsia="Aptos"/>
+          <w:b/>
+          <w:i w:val="0"/>
+          <w:color w:val="1F2D3D"/>
+          <w:sz w:val="22"/>
+        </w:rPr>
+        <w:t>Планы</w:t>
+      </w:r>
+      <w:r>
+        <w:rPr>
+          <w:rFonts w:ascii="Aptos" w:hAnsi="Aptos" w:eastAsia="Aptos"/>
+          <w:b w:val="0"/>
+          <w:i w:val="0"/>
+          <w:color w:val="1F2D3D"/>
+          <w:sz w:val="22"/>
+        </w:rPr>
+        <w:t xml:space="preserve"> — сколько из этих денег ещё нельзя считать свободными.</w:t>
+      </w:r>
+    </w:p>
+    <w:p>
+      <w:pPr>
+        <w:pStyle w:val="ListNumber"/>
+        <w:spacing w:after="60" w:line="269" w:lineRule="auto"/>
+        <w:ind w:left="461" w:hanging="259"/>
+      </w:pPr>
+      <w:r>
+        <w:rPr>
+          <w:rFonts w:ascii="Aptos" w:hAnsi="Aptos" w:eastAsia="Aptos"/>
+          <w:b/>
+          <w:i w:val="0"/>
+          <w:color w:val="1F2D3D"/>
+          <w:sz w:val="22"/>
+        </w:rPr>
+        <w:t>Операции</w:t>
+      </w:r>
+      <w:r>
+        <w:rPr>
+          <w:rFonts w:ascii="Aptos" w:hAnsi="Aptos" w:eastAsia="Aptos"/>
+          <w:b w:val="0"/>
+          <w:i w:val="0"/>
+          <w:color w:val="1F2D3D"/>
+          <w:sz w:val="22"/>
+        </w:rPr>
+        <w:t xml:space="preserve"> — единственный способ изменить реальные деньги.</w:t>
       </w:r>
     </w:p>
     <w:p>
@@ -2807,162 +1626,7 @@
           <w:color w:val="1F2D3D"/>
           <w:sz w:val="22"/>
         </w:rPr>
-        <w:t>Свободный остаток:</w:t>
-      </w:r>
-    </w:p>
-    <w:p>
-      <w:pPr>
-        <w:spacing w:after="140" w:line="276" w:lineRule="auto" w:before="60"/>
-        <w:ind w:left="230" w:right="230"/>
-        <w:shd w:fill="EEF5F1"/>
-      </w:pPr>
-      <w:r>
-        <w:rPr>
-          <w:rFonts w:ascii="Aptos" w:hAnsi="Aptos" w:eastAsia="Aptos"/>
-          <w:b/>
-          <w:i w:val="0"/>
-          <w:color w:val="405B5E"/>
-          <w:sz w:val="23"/>
-        </w:rPr>
-        <w:t>2 000 + 100 - 1 600 = 500 BYN</w:t>
-      </w:r>
-    </w:p>
-    <w:p>
-      <w:pPr>
-        <w:spacing w:after="100" w:line="276" w:lineRule="auto"/>
-      </w:pPr>
-      <w:r>
-        <w:rPr>
-          <w:rFonts w:ascii="Aptos" w:hAnsi="Aptos" w:eastAsia="Aptos"/>
-          <w:b w:val="0"/>
-          <w:i w:val="0"/>
-          <w:color w:val="1F2D3D"/>
-          <w:sz w:val="22"/>
-        </w:rPr>
-        <w:t>Потом вы заплатили 100 BYN за еду. Эти деньги уже были внутри плана еды, поэтому:</w:t>
-      </w:r>
-    </w:p>
-    <w:p>
-      <w:pPr>
-        <w:pStyle w:val="ListBullet"/>
-        <w:spacing w:after="60" w:line="269" w:lineRule="auto"/>
-        <w:ind w:left="403" w:hanging="230"/>
-      </w:pPr>
-      <w:r>
-        <w:rPr>
-          <w:rFonts w:ascii="Aptos" w:hAnsi="Aptos" w:eastAsia="Aptos"/>
-          <w:b w:val="0"/>
-          <w:i w:val="0"/>
-          <w:color w:val="1F2D3D"/>
-          <w:sz w:val="22"/>
-        </w:rPr>
-        <w:t>фактический остаток на счете стал меньше на 100 BYN;</w:t>
-      </w:r>
-    </w:p>
-    <w:p>
-      <w:pPr>
-        <w:pStyle w:val="ListBullet"/>
-        <w:spacing w:after="60" w:line="269" w:lineRule="auto"/>
-        <w:ind w:left="403" w:hanging="230"/>
-      </w:pPr>
-      <w:r>
-        <w:rPr>
-          <w:rFonts w:ascii="Aptos" w:hAnsi="Aptos" w:eastAsia="Aptos"/>
-          <w:b w:val="0"/>
-          <w:i w:val="0"/>
-          <w:color w:val="1F2D3D"/>
-          <w:sz w:val="22"/>
-        </w:rPr>
-        <w:t>свободный остаток остался 500 BYN;</w:t>
-      </w:r>
-    </w:p>
-    <w:p>
-      <w:pPr>
-        <w:pStyle w:val="ListBullet"/>
-        <w:spacing w:after="60" w:line="269" w:lineRule="auto"/>
-        <w:ind w:left="403" w:hanging="230"/>
-      </w:pPr>
-      <w:r>
-        <w:rPr>
-          <w:rFonts w:ascii="Aptos" w:hAnsi="Aptos" w:eastAsia="Aptos"/>
-          <w:b w:val="0"/>
-          <w:i w:val="0"/>
-          <w:color w:val="1F2D3D"/>
-          <w:sz w:val="22"/>
-        </w:rPr>
-        <w:t>повторно вычитать эти 100 BYN нельзя.</w:t>
-      </w:r>
-    </w:p>
-    <w:p>
-      <w:pPr>
-        <w:spacing w:after="100" w:line="276" w:lineRule="auto"/>
-      </w:pPr>
-      <w:r>
-        <w:rPr>
-          <w:rFonts w:ascii="Aptos" w:hAnsi="Aptos" w:eastAsia="Aptos"/>
-          <w:b w:val="0"/>
-          <w:i w:val="0"/>
-          <w:color w:val="1F2D3D"/>
-          <w:sz w:val="22"/>
-        </w:rPr>
-        <w:t>Если затем вы потратили на еду еще 350 BYN, всего получится 450 BYN при плане 400 BYN. Перерасход 50 BYN уменьшит свободный остаток:</w:t>
-      </w:r>
-    </w:p>
-    <w:p>
-      <w:pPr>
-        <w:spacing w:after="140" w:line="276" w:lineRule="auto" w:before="60"/>
-        <w:ind w:left="230" w:right="230"/>
-        <w:shd w:fill="EEF5F1"/>
-      </w:pPr>
-      <w:r>
-        <w:rPr>
-          <w:rFonts w:ascii="Aptos" w:hAnsi="Aptos" w:eastAsia="Aptos"/>
-          <w:b/>
-          <w:i w:val="0"/>
-          <w:color w:val="405B5E"/>
-          <w:sz w:val="23"/>
-        </w:rPr>
-        <w:t>500 - 50 = 450 BYN</w:t>
-      </w:r>
-    </w:p>
-    <w:p>
-      <w:pPr>
-        <w:pStyle w:val="Heading1"/>
-      </w:pPr>
-      <w:r>
-        <w:t>Главное правило</w:t>
-      </w:r>
-    </w:p>
-    <w:p>
-      <w:pPr>
-        <w:spacing w:after="140" w:line="276" w:lineRule="auto" w:before="60"/>
-        <w:ind w:left="230" w:right="230"/>
-        <w:shd w:fill="EEF5F1"/>
-      </w:pPr>
-      <w:r>
-        <w:rPr>
-          <w:rFonts w:ascii="Aptos" w:hAnsi="Aptos" w:eastAsia="Aptos"/>
-          <w:b/>
-          <w:i w:val="0"/>
-          <w:color w:val="405B5E"/>
-          <w:sz w:val="23"/>
-        </w:rPr>
-        <w:t>Фактический остаток показывает, сколько денег физически осталось. Свободный остаток показывает, сколько из них еще никому не обещано.</w:t>
-      </w:r>
-    </w:p>
-    <w:p>
-      <w:pPr>
-        <w:spacing w:after="100" w:line="276" w:lineRule="auto"/>
-      </w:pPr>
-      <w:r>
-        <w:rPr>
-          <w:rFonts w:ascii="Aptos" w:hAnsi="Aptos" w:eastAsia="Aptos"/>
-          <w:b w:val="0"/>
-          <w:i w:val="0"/>
-          <w:color w:val="1F2D3D"/>
-          <w:sz w:val="22"/>
-        </w:rPr>
-        <w:t>План резервирует деньги заранее. Фактическая трата внутри плана не должна вычитаться из свободного остатка второй раз.</w:t>
+        <w:t>Новый месяц не переносит остаток. Общий счёт просто продолжает жить дальше.</w:t>
       </w:r>
     </w:p>
     <w:sectPr>

</xml_diff>

<commit_message>
Show editable category spending in month view
</commit_message>
<xml_diff>
--- a/docs/calculation-logic-ru.docx
+++ b/docs/calculation-logic-ru.docx
@@ -862,6 +862,21 @@
           <w:color w:val="1F2D3D"/>
           <w:sz w:val="22"/>
         </w:rPr>
+        <w:t>Во вкладке «Месяц» у каждой категории отдельно видны «План» и «Потрачено». Сумму «Потрачено» можно исправить вручную. Тогда приложение создаёт корректировку на разницу и одновременно обновляет счёт, свободный остаток и историю операций.</w:t>
+      </w:r>
+    </w:p>
+    <w:p>
+      <w:pPr>
+        <w:spacing w:after="100" w:line="276" w:lineRule="auto"/>
+      </w:pPr>
+      <w:r>
+        <w:rPr>
+          <w:rFonts w:ascii="Aptos" w:hAnsi="Aptos" w:eastAsia="Aptos"/>
+          <w:b w:val="0"/>
+          <w:i w:val="0"/>
+          <w:color w:val="1F2D3D"/>
+          <w:sz w:val="22"/>
+        </w:rPr>
         <w:t>Все места приложения используют одну и ту же категорию, её название и иконку.</w:t>
       </w:r>
     </w:p>

</xml_diff>

<commit_message>
Fix weekly food and pet expense tracking
</commit_message>
<xml_diff>
--- a/docs/calculation-logic-ru.docx
+++ b/docs/calculation-logic-ru.docx
@@ -930,6 +930,21 @@
           <w:color w:val="1F2D3D"/>
           <w:sz w:val="22"/>
         </w:rPr>
+        <w:t>В каждой недельной карточке отдельно показаны исходный план, уже потраченная сумма и остаток. Трата, внесённая кнопкой минус на главной, сразу появляется в текущей неделе. Текущая неделя помечена словом «Сейчас».</w:t>
+      </w:r>
+    </w:p>
+    <w:p>
+      <w:pPr>
+        <w:spacing w:after="100" w:line="276" w:lineRule="auto"/>
+      </w:pPr>
+      <w:r>
+        <w:rPr>
+          <w:rFonts w:ascii="Aptos" w:hAnsi="Aptos" w:eastAsia="Aptos"/>
+          <w:b w:val="0"/>
+          <w:i w:val="0"/>
+          <w:color w:val="1F2D3D"/>
+          <w:sz w:val="22"/>
+        </w:rPr>
         <w:t>В понедельник в 00:00 прошлая неделя закрывается автоматически. Неиспользованный план закрытой недели больше не считается занятым.</w:t>
       </w:r>
     </w:p>
@@ -1262,6 +1277,21 @@
           <w:sz w:val="22"/>
         </w:rPr>
         <w:t>Покупка для питомца или готовый подарок уменьшают только соответствующий внутренний баланс.</w:t>
+      </w:r>
+    </w:p>
+    <w:p>
+      <w:pPr>
+        <w:spacing w:after="100" w:line="276" w:lineRule="auto"/>
+      </w:pPr>
+      <w:r>
+        <w:rPr>
+          <w:rFonts w:ascii="Aptos" w:hAnsi="Aptos" w:eastAsia="Aptos"/>
+          <w:b w:val="0"/>
+          <w:i w:val="0"/>
+          <w:color w:val="1F2D3D"/>
+          <w:sz w:val="22"/>
+        </w:rPr>
+        <w:t>Если в быстром расходе на главной выбрана категория «Питомец», сумма списывается из баланса питомца и появляется в его истории. Обычный счёт повторно не уменьшается, потому что он уже изменился при пополнении конверта.</w:t>
       </w:r>
     </w:p>
     <w:p>

</xml_diff>